<commit_message>
Adapt assignment to the Arab education sector; make text all black
Reset the paper in an Arab-sector context: an Arab beginning teacher
(Reem) in a Galilee village school, with culturally grounded relationships,
gender and community expectations, and the interview presented as
translated from Arabic. Removed all color so headings and body render in
black. Kept the Gilligan listening-guide structure and RTL formatting.

Co-Authored-By: Claude Opus 4.8 <noreply@anthropic.com>
Claude-Session: https://claude.ai/code/session_01RbgP5xo8dmoCfJMjFozdfN
</commit_message>
<xml_diff>
--- a/עבודה מסכמת - מחקר מתקדם בחינוך - גראם.docx
+++ b/עבודה מסכמת - מחקר מתקדם בחינוך - גראם.docx
@@ -77,7 +77,7 @@
           <w:rFonts w:ascii="David" w:hAnsi="David" w:cs="David"/>
           <w:b/>
           <w:bCs/>
-          <w:color w:val="1F3A5F"/>
+          <w:color w:val="000000"/>
           <w:sz w:val="60"/>
           <w:szCs w:val="60"/>
           <w:rtl w:val="1"/>
@@ -95,7 +95,7 @@
         <w:rPr>
           <w:rFonts w:ascii="David" w:hAnsi="David" w:cs="David"/>
           <w:b w:val="0"/>
-          <w:color w:val="1A1A1A"/>
+          <w:color w:val="000000"/>
           <w:sz w:val="36"/>
           <w:szCs w:val="36"/>
           <w:rtl w:val="1"/>
@@ -114,12 +114,12 @@
           <w:rFonts w:ascii="David" w:hAnsi="David" w:cs="David"/>
           <w:b/>
           <w:bCs/>
-          <w:color w:val="1A1A1A"/>
+          <w:color w:val="000000"/>
           <w:sz w:val="40"/>
           <w:szCs w:val="40"/>
           <w:rtl w:val="1"/>
         </w:rPr>
-        <w:t>חוויית השנה הראשונה בהוראה של מורות מתחילות</w:t>
+        <w:t>חוויית השנה הראשונה בהוראה של מורות מתחילות במגזר הערבי</w:t>
       </w:r>
     </w:p>
     <w:p>
@@ -132,7 +132,7 @@
         <w:rPr>
           <w:rFonts w:ascii="David" w:hAnsi="David" w:cs="David"/>
           <w:b w:val="0"/>
-          <w:color w:val="1A1A1A"/>
+          <w:color w:val="000000"/>
           <w:sz w:val="28"/>
           <w:szCs w:val="28"/>
           <w:rtl w:val="1"/>
@@ -150,7 +150,7 @@
         <w:rPr>
           <w:rFonts w:ascii="David" w:hAnsi="David" w:cs="David"/>
           <w:b w:val="0"/>
-          <w:color w:val="1A1A1A"/>
+          <w:color w:val="000000"/>
           <w:sz w:val="28"/>
           <w:szCs w:val="28"/>
           <w:rtl w:val="1"/>
@@ -177,7 +177,7 @@
           <w:rFonts w:ascii="David" w:hAnsi="David" w:cs="David"/>
           <w:b/>
           <w:bCs/>
-          <w:color w:val="1F3A5F"/>
+          <w:color w:val="000000"/>
           <w:sz w:val="34"/>
           <w:szCs w:val="34"/>
           <w:rtl w:val="1"/>
@@ -323,7 +323,7 @@
           <w:rFonts w:ascii="David" w:hAnsi="David" w:cs="David"/>
           <w:b/>
           <w:bCs/>
-          <w:color w:val="1F3A5F"/>
+          <w:color w:val="000000"/>
           <w:sz w:val="34"/>
           <w:szCs w:val="34"/>
           <w:rtl w:val="1"/>
@@ -345,7 +345,7 @@
           <w:szCs w:val="24"/>
           <w:rtl w:val="1"/>
         </w:rPr>
-        <w:t>הנושא שבחרתי לחקור הוא חוויית השנה הראשונה בהוראה של מורות מתחילות. לא הגעתי אליו במקרה. אני עומדת בעצמי בסוף התואר, עוד שנה ואני אמורה להיכנס לכיתה, ובכל פעם שאני שומעת מורה ותיקה אומרת "השנה הראשונה, אוי, השנה הראשונה", משהו אצלי מתכווץ. רציתי להבין מה עומד מאחורי המשפט הזה. מה באמת קורה לאישה צעירה ביום שהיא נכנסת לכיתה בפעם הראשונה בתור המורה, ולא בתור הסטודנטית שיושבת מאחור וצופה.</w:t>
+        <w:t>הנושא שבחרתי לחקור הוא חוויית השנה הראשונה בהוראה של מורות מתחילות במגזר הערבי. לא הגעתי אליו במקרה. אני עומדת בעצמי בסוף התואר, עוד שנה ואני אמורה להיכנס לכיתה, ובכל פעם שאני שומעת מורה ותיקה מהכפר אומרת "השנה הראשונה, יא רית חשבו עלינו אז", משהו אצלי מתכווץ. רציתי להבין מה עומד מאחורי המשפט הזה. מה באמת קורה לאישה ערבייה צעירה ביום שהיא נכנסת לכיתה בפעם הראשונה בתור המורה, ולא בתור הסטודנטית שיושבת מאחור וצופה.</w:t>
       </w:r>
     </w:p>
     <w:p>
@@ -379,7 +379,7 @@
           <w:szCs w:val="24"/>
           <w:rtl w:val="1"/>
         </w:rPr>
-        <w:t>מה שמושך אותי זה הפער. הפער בין מה שמספרים לנו בלימודים לבין מה שקורה בשטח. לומדים אצלנו על תיאוריות של הוראה, על ניהול כיתה, על הערכה, ומדברים על זה בשפה נקייה ומסודרת. ואז את מגיעה, ובתוך שבוע כל התיאוריות מתפוגגות ואת עומדת מול שלושים ילדים שרוצים ממך משהו, ואת לבד. מעניין אותי הרגע הזה של הבדידות. מעניין אותי גם הצד המגדרי, כי רוב המורות בבית ספר יסודי הן נשים צעירות, ויש משהו בציפייה מהן שהוא לא רק מקצועי. מצפים ממורה צעירה שתהיה גם אמא, גם אחות גדולה, גם מישהי שתמיד נותנת ולא מתלוננת. רציתי לשמוע איך זה מרגיש מבפנים.</w:t>
+        <w:t>מה שמושך אותי זה הפער. הפער בין מה שמספרים לנו בלימודים לבין מה שקורה בשטח, ובמגזר שלנו הפער הזה גדול עוד יותר. לומדים אצלנו על תיאוריות של הוראה, על ניהול כיתה, על הערכה, ומדברים על זה בשפה נקייה ומסודרת. ואז את מגיעה לבית ספר בכפר, לכיתה עם שלושים וחמישה ילדים בחדר קטן, בלי חצי מהמשאבים, ואת לבד. מעניין אותי הרגע הזה של הבדידות. מעניין אותי גם הצד המגדרי, כי רוב המורות בבתי הספר היסודיים אצלנו הן נשים צעירות, ויש עליהן ציפייה שהיא לא רק מקצועית. מצפים ממורה צעירה שתהיה גם מחנכת, גם כמו אחות גדולה, גם בת טובה שמתחתנת בזמן, וגם מישהי שלא מתלוננת. רציתי לשמוע איך זה מרגיש מבפנים.</w:t>
       </w:r>
     </w:p>
     <w:p>
@@ -413,7 +413,7 @@
           <w:szCs w:val="24"/>
           <w:rtl w:val="1"/>
         </w:rPr>
-        <w:t>אני אישה, צעירה, בת עשרים וחמש, ואני יודעת שאני נכנסת לחקור נושא שהוא בעצם העתיד שלי. אני לא ניגשת אליו מבחוץ. יש לי חרדה משלי לגבי הכניסה להוראה, ואני חושבת שהחרדה הזאת מלווה אותי לכל אורך הראיון, גם בשאלות שבחרתי לשאול וגם באלה שנמנעתי מהן. מבחינה מעמדית גדלתי במשפחה של מעמד ביניים, שני הורים עובדים, לא עשירים אבל לא חסר לנו. ההורים שלי תמיד ראו בהוראה עבודה מכובדת אבל "לא משהו שמתעשרים ממנו", וזה נשאר איתי. אני מגיעה לנושא עם הנחה סמויה שמורות עובדות קשה מאוד ומקבלות מעט מדי, גם כסף וגם הכרה, ואני צריכה לזכור שההנחה הזאת שלי, לא בהכרח של המרואיינת. יכול להיות שהיא חווה את הדברים אחרת, ואני צריכה להיזהר לא לשים לה מילים בפה.</w:t>
+        <w:t>אני אישה ערבייה, צעירה, בת עשרים וחמש, ואני יודעת שאני נכנסת לחקור נושא שהוא בעצם העתיד שלי. אני לא ניגשת אליו מבחוץ. יש לי חרדה משלי לגבי הכניסה להוראה, ואני חושבת שהחרדה הזאת מלווה אותי לכל אורך הראיון, גם בשאלות שבחרתי לשאול וגם באלה שנמנעתי מהן. מבחינה מעמדית גדלתי בכפר, במשפחה של מעמד ביניים, אבא עבד בבנייה ואמא בבית, לא היה חסר לנו אבל גם לא היה עודף. אצלנו הוראה תמיד נחשבה למקצוע הכי מכובד שבת יכולה ללכת אליו, "עבודה שמתאימה לאישה", כי היא נגמרת בצהריים ומאפשרת להיות גם אמא. ההבנה הזאת נשארה איתי, וגם קצת מכעיסה אותי. אני מגיעה לנושא עם הנחה סמויה שבחרו בשבילנו את המקצוע הזה עוד לפני שבחרנו בעצמנו, ואני צריכה לזכור שההנחה הזאת שלי, לא בהכרח של המרואיינת. יכול להיות שהיא חווה את הדברים אחרת, ואני צריכה להיזהר לא לשים לה מילים בפה.</w:t>
       </w:r>
     </w:p>
     <w:p>
@@ -447,7 +447,7 @@
           <w:szCs w:val="24"/>
           <w:rtl w:val="1"/>
         </w:rPr>
-        <w:t>אם אני כנה, יש לי פנטזיה שלמה. אני מדמיינת שהראיון יחשוף איזו אמת גדולה שכולם יודעים אבל אף אחד לא אומר בקול, שהמערכת זורקת מורות צעירות למים ומצפה מהן לשחות לבד, ושזאת הסיבה שכל כך הרבה עוזבות בשנים הראשונות. אני מדמיינת שהעבודה הזאת, אולי, תגיע למישהו שמחליט דברים, ושמישהו יקרא ויגיד "רגע, צריך לשנות את זה". אני יודעת שזאת פנטזיה קצת גדולה על עבודה של סטודנטית, ואני מחייכת לעצמי כשאני כותבת את זה. אבל היא שם, והיא חלק ממה שהניע אותי.</w:t>
+        <w:t>אם אני כנה, יש לי פנטזיה שלמה. אני מדמיינת שהראיון יחשוף איזו אמת גדולה שכולן יודעות אבל אף אחת לא אומרת בקול, שהמערכת זורקת מורות ערביות צעירות למים ומצפה מהן לשחות לבד, ושזאת הסיבה שכל כך הרבה שוחקות ונשברות בשנים הראשונות. אני מדמיינת שהעבודה הזאת, אולי, תגיע למישהו שמחליט דברים, ושמישהו יקרא ויגיד "רגע, צריך לתת להן ליווי אמיתי". אני יודעת שזאת פנטזיה קצת גדולה על עבודה של סטודנטית, ואני מחייכת לעצמי כשאני כותבת את זה. אבל היא שם, והיא חלק ממה שהניע אותי.</w:t>
       </w:r>
     </w:p>
     <w:p>
@@ -461,7 +461,7 @@
           <w:rFonts w:ascii="David" w:hAnsi="David" w:cs="David"/>
           <w:b/>
           <w:bCs/>
-          <w:color w:val="1F3A5F"/>
+          <w:color w:val="000000"/>
           <w:sz w:val="34"/>
           <w:szCs w:val="34"/>
           <w:rtl w:val="1"/>
@@ -500,7 +500,7 @@
           <w:szCs w:val="24"/>
           <w:rtl w:val="1"/>
         </w:rPr>
-        <w:t>•  מהי חווייתן של מורות מתחילות בשנת עבודתן הראשונה במערכת החינוך?</w:t>
+        <w:t>•  מהי חווייתן של מורות מתחילות במגזר הערבי בשנת עבודתן הראשונה במערכת החינוך?</w:t>
       </w:r>
     </w:p>
     <w:p>
@@ -534,7 +534,7 @@
           <w:szCs w:val="24"/>
           <w:rtl w:val="1"/>
         </w:rPr>
-        <w:t>•  איזה מקום תופסות מערכות היחסים בבית הספר, עם התלמידים, עם הצוות הוותיק ועם המנהלת, בחוויית ההשתלבות של המורה המתחילה?</w:t>
+        <w:t>•  איזה מקום תופסות מערכות היחסים בבית הספר, עם התלמידים, עם הצוות הוותיק ועם המנהל, בחוויית ההשתלבות של המורה המתחילה?</w:t>
       </w:r>
     </w:p>
     <w:p>
@@ -551,7 +551,7 @@
           <w:szCs w:val="24"/>
           <w:rtl w:val="1"/>
         </w:rPr>
-        <w:t>•  כיצד באים לידי ביטוי תכתיבים חברתיים ומגדריים סביב דמות "המורה הטובה", וכיצד מתמודדת עמם המורה המתחילה?</w:t>
+        <w:t>•  כיצד באים לידי ביטוי תכתיבים חברתיים ומגדריים בחברה הערבית סביב דמות "המורה הטובה", וכיצד מתמודדת עמם המורה המתחילה?</w:t>
       </w:r>
     </w:p>
     <w:p>
@@ -565,7 +565,7 @@
           <w:rFonts w:ascii="David" w:hAnsi="David" w:cs="David"/>
           <w:b/>
           <w:bCs/>
-          <w:color w:val="1F3A5F"/>
+          <w:color w:val="000000"/>
           <w:sz w:val="34"/>
           <w:szCs w:val="34"/>
           <w:rtl w:val="1"/>
@@ -774,7 +774,7 @@
           <w:szCs w:val="24"/>
           <w:rtl w:val="1"/>
         </w:rPr>
-        <w:t>•  מה היחס של המנהלת אליך?</w:t>
+        <w:t>•  מה היחס של המנהל אלייך?</w:t>
       </w:r>
     </w:p>
     <w:p>
@@ -808,7 +808,7 @@
           <w:szCs w:val="24"/>
           <w:rtl w:val="1"/>
         </w:rPr>
-        <w:t>•  מה אנשים מסביבך, במשפחה או בין החברים, אומרים לך על העבודה שלך?</w:t>
+        <w:t>•  מה אנשים סביבך, במשפחה ובכפר, אומרים לך על העבודה שלך?</w:t>
       </w:r>
     </w:p>
     <w:p>
@@ -975,7 +975,7 @@
           <w:rFonts w:ascii="David" w:hAnsi="David" w:cs="David"/>
           <w:b/>
           <w:bCs/>
-          <w:color w:val="1F3A5F"/>
+          <w:color w:val="000000"/>
           <w:sz w:val="34"/>
           <w:szCs w:val="34"/>
           <w:rtl w:val="1"/>
@@ -997,7 +997,7 @@
           <w:szCs w:val="24"/>
           <w:rtl w:val="1"/>
         </w:rPr>
-        <w:t>ניתחתי את הראיון על פי מדריך ההקשבה של קרול גיליגן, כפי שלמדנו ביחידות שבע ושמונה, שלב אחר שלב.</w:t>
+        <w:t>ניתחתי את הראיון על פי מדריך ההקשבה של קרול גיליגן, כפי שלמדנו ביחידות שבע ושמונה ובמצגת של השיעור השלישי, שלב אחר שלב.</w:t>
       </w:r>
     </w:p>
     <w:p>
@@ -1011,7 +1011,7 @@
           <w:rFonts w:ascii="David" w:hAnsi="David" w:cs="David"/>
           <w:b/>
           <w:bCs/>
-          <w:color w:val="1A1A1A"/>
+          <w:color w:val="000000"/>
           <w:sz w:val="27"/>
           <w:szCs w:val="27"/>
           <w:rtl w:val="1"/>
@@ -1033,7 +1033,7 @@
           <w:szCs w:val="24"/>
           <w:rtl w:val="1"/>
         </w:rPr>
-        <w:t>מיכל, מורה מתחילה בת עשרים ושבע, מלמדת כיתה ג' בבית ספר יסודי בעיר בדרום. זו שנתה הראשונה המלאה. היא מספרת על הפער בין ההתלהבות שאיתה נכנסה לבין העייפות והבדידות שפגשה בשטח. זה סיפור על מישהי שרצתה מאוד, שנפלה, ושמצאה במהלך הדרך גם רגעים של משמעות שהחזיקו אותה. במרכז הסיפור עומד מתח מתמשך בין הרצון לתת לבין התחושה שאין לה על מי להישען.</w:t>
+        <w:t>רים, מורה מתחילה בת עשרים ושבע, מלמדת כיתה ג' בבית ספר יסודי בכפר בגליל. זו שנתה הראשונה המלאה. היא מספרת על הפער בין ההתלהבות שאיתה נכנסה לבין העייפות והבדידות שפגשה בשטח. זה סיפור על מישהי שרצתה מאוד, שנפלה, ושמצאה במהלך הדרך גם רגעים של משמעות שהחזיקו אותה. במרכז הסיפור עומד מתח מתמשך בין הרצון לתת לבין התחושה שאין לה על מי להישען, בתוך מערכת ובתוך חברה שמצפות ממנה להרבה ונותנות מעט.</w:t>
       </w:r>
     </w:p>
     <w:p>
@@ -1047,7 +1047,7 @@
           <w:rFonts w:ascii="David" w:hAnsi="David" w:cs="David"/>
           <w:b/>
           <w:bCs/>
-          <w:color w:val="1A1A1A"/>
+          <w:color w:val="000000"/>
           <w:sz w:val="27"/>
           <w:szCs w:val="27"/>
           <w:rtl w:val="1"/>
@@ -1069,7 +1069,7 @@
           <w:szCs w:val="24"/>
           <w:rtl w:val="1"/>
         </w:rPr>
-        <w:t>מיכל ממקמת את עצמה בתרבות ישראלית מובהקת של מערכת החינוך הציבורית בפריפריה. היא מדברת על "הצוות הוותיק", על "המנהלת", על ישיבות והשתלמויות, כל הסממנים של בית ספר ממלכתי. היא בת של מקום שבו הוראה נתפסת גם כשליחות וגם כעבודה שוחקת ולא מתוגמלת. כשהיא אומרת "אצלנו בדרום אין למי לברוח", היא ממקמת את עצמה גם גיאוגרפית, בתוך אזור שבו הבחירה במקומות עבודה מצומצמת, ולזה יש משקל בחוויה שלה.</w:t>
+        <w:t>רים ממקמת את עצמה בתוך החברה הערבית בכפר בגליל, ובתוך מערכת החינוך הערבית על מצוקותיה. היא מדברת על כיתות צפופות, על מחסור במשאבים, על "הצוות הוותיק", על המנהל. היא בת של מקום שבו הוראה נתפסת גם כשליחות וגם כמקצוע ה"מתאים לבת", כזה שמאפשר להתחתן ולגדל ילדים. כשהיא אומרת "אצלנו בכפר כולם מכירים את כולם, אין לאן לברוח", היא ממקמת את עצמה גם בתוך קהילה קטנה וצפופה, שבה המורה חשופה לעיני כולם, וגם המצוקה שלה נראית לכולם. יש לזה משקל גדול בחוויה שלה.</w:t>
       </w:r>
     </w:p>
     <w:p>
@@ -1083,7 +1083,7 @@
           <w:rFonts w:ascii="David" w:hAnsi="David" w:cs="David"/>
           <w:b/>
           <w:bCs/>
-          <w:color w:val="1A1A1A"/>
+          <w:color w:val="000000"/>
           <w:sz w:val="27"/>
           <w:szCs w:val="27"/>
           <w:rtl w:val="1"/>
@@ -1105,7 +1105,7 @@
           <w:szCs w:val="24"/>
           <w:rtl w:val="1"/>
         </w:rPr>
-        <w:t>בסיפור של מיכל עולות כמה מערכות יחסים. הראשונה והמרכזית היא עם התלמידים, ובתוכם בלט עומר, ילד שהיא תיארה בפירוט רב וקשר אליו רגשות חזקים. השנייה היא עם רונית, החונכת שלה, קשר אמביוולנטי של הערכה מצד אחד ואכזבה מצד שני. השלישית היא עם הצוות הוותיק בחדר המורים, שממנו היא חשה מרוחקת. הרביעית היא עם המנהלת, דמות סמכותית שנוכחת אך לא ממש נגישה. יש גם קשר שהיא כמעט לא הזכירה, בן הזוג שלה בבית, וההיעדר הזה בלט לי דווקא. שאלתי את עצמי אם החיים הזוגיים נדחקו החוצה בגלל העומס, וזה נראה לי משמעותי לא פחות מהקשרים שכן סופרו.</w:t>
+        <w:t>בסיפור של רים עולות כמה מערכות יחסים. הראשונה והמרכזית היא עם התלמידים, ובתוכם בלט כרים, ילד שהיא תיארה בפירוט רב וקשרה אליו רגשות חזקים. השנייה היא עם סועאד, החונכת שלה, קשר אמביוולנטי של הערכה מצד אחד ואכזבה מצד שני. השלישית היא עם הצוות הוותיק בחדר המורים, שממנו היא חשה מרוחקת. הרביעית היא עם המנהל, דמות סמכותית וגברית שנוכחת אך לא ממש נגישה. יש גם קשר שהיא כמעט לא הזכירה, בעלה סאמי בבית, וההיעדר הזה בלט לי דווקא. שאלתי את עצמי אם החיים הזוגיים נדחקו החוצה בגלל העומס, וזה נראה לי משמעותי לא פחות מהקשרים שכן סופרו.</w:t>
       </w:r>
     </w:p>
     <w:p>
@@ -1119,7 +1119,7 @@
           <w:rFonts w:ascii="David" w:hAnsi="David" w:cs="David"/>
           <w:b/>
           <w:bCs/>
-          <w:color w:val="1A1A1A"/>
+          <w:color w:val="000000"/>
           <w:sz w:val="27"/>
           <w:szCs w:val="27"/>
           <w:rtl w:val="1"/>
@@ -1141,7 +1141,7 @@
           <w:szCs w:val="24"/>
           <w:rtl w:val="1"/>
         </w:rPr>
-        <w:t>לאורך הראיון הרגשתי הזדהות חזקה, אולי חזקה מדי. כמעט בכל משפט שמיכל אמרה מצאתי את עצמי חושבת "זה בדיוק מה שאני מפחדת שיקרה לי". הייתי צריכה לעצור את עצמי, כי הזדהות כזאת מסוכנת, היא גורמת לך לשמוע רק את מה שמאשר את הפחדים שלך. היו גם רגעים של חוסר סבלנות קטן, כשמיכל אמרה שהיא "לא מתחרטת על שנייה" מיד אחרי שסיפרה על בכי בשירותים, ורציתי לומר לה שזה לא מסתדר. עצרתי, ובניתוח החזרתי לזה. חשתי כלפיה בעיקר חום וכבוד.</w:t>
+        <w:t>לאורך הראיון הרגשתי הזדהות חזקה, אולי חזקה מדי. כמעט בכל משפט שרים אמרה מצאתי את עצמי חושבת "זה בדיוק מה שאני מפחדת שיקרה לי". הייתי צריכה לעצור את עצמי, כי הזדהות כזאת מסוכנת, היא גורמת לך לשמוע רק את מה שמאשר את הפחדים שלך. היו גם רגעים של חוסר סבלנות קטן, כשרים אמרה שהיא "לא מתחרטת על שנייה" מיד אחרי שסיפרה על בכי בשירותים, ורציתי לומר לה שזה לא מסתדר. עצרתי, ובניתוח החזרתי לזה. חשתי כלפיה בעיקר חום וכבוד, ואולי גם קצת אשמה, כי אני יודעת שבעוד שנה אני אשב במקומה.</w:t>
       </w:r>
     </w:p>
     <w:p>
@@ -1155,7 +1155,7 @@
           <w:rFonts w:ascii="David" w:hAnsi="David" w:cs="David"/>
           <w:b/>
           <w:bCs/>
-          <w:color w:val="1A1A1A"/>
+          <w:color w:val="000000"/>
           <w:sz w:val="27"/>
           <w:szCs w:val="27"/>
           <w:rtl w:val="1"/>
@@ -1177,7 +1177,7 @@
           <w:szCs w:val="24"/>
           <w:rtl w:val="1"/>
         </w:rPr>
-        <w:t>השפה של מיכל מלאה במטאפורות של מים וטביעה. "זרקו אותי למים העמוקים", היא אמרה, ובהמשך "יש ימים שאני פשוט מרגישה שאני טובעת". במקום אחר תיארה את הכיתה בשפה של קרב: "כל בוקר זה עוד קרב, ואת לא יודעת אם ניצחת עד שהם יוצאים". לצד אלה חזרה גם מטאפורה חמה, "הכיתה הפכה להיות בית שני שלי", ודווקא הפער בין השפה של הטביעה והקרב לבין השפה של הבית מספר הרבה על מורכבות החוויה שלה. הביטוי שחזר אצלה שוב ושוב היה "אין למי", אין למי לפנות, אין למי לספר, אין למי לברוח.</w:t>
+        <w:t>השפה של רים מלאה במטאפורות של מים וטביעה. "זרקו אותי למים ומי שלא יודע לשחות, טובע", היא אמרה, ובהמשך "יש ימים שאני פשוט מרגישה שאני טובעת". במקום אחר תיארה את הכיתה בשפה של קרב: "כל בוקר זה עוד מערכה, ואת לא יודעת אם ניצחת עד שהם יוצאים". לצד אלה חזרה גם מטאפורה חמה, "הכיתה הפכה להיות הבית השני שלי". דווקא הפער בין השפה של הטביעה והקרב לבין השפה של הבית מספר הרבה על מורכבות החוויה. שני ביטויים חזרו אצלה שוב ושוב, "אין למי" מצד אחד, אין למי לפנות, אין למי לספר, ומצד שני "אלחמדוללה", שאותו אמרה גם ברגעים הקשים, כמעט כמו נשימה שמחזיקה אותה.</w:t>
       </w:r>
     </w:p>
     <w:p>
@@ -1191,7 +1191,7 @@
           <w:rFonts w:ascii="David" w:hAnsi="David" w:cs="David"/>
           <w:b/>
           <w:bCs/>
-          <w:color w:val="1A1A1A"/>
+          <w:color w:val="000000"/>
           <w:sz w:val="27"/>
           <w:szCs w:val="27"/>
           <w:rtl w:val="1"/>
@@ -1213,7 +1213,7 @@
           <w:szCs w:val="24"/>
           <w:rtl w:val="1"/>
         </w:rPr>
-        <w:t>הראיון מלא בסתירות, ואני בחרתי לא ליישר אותן. מיכל אמרה "אני לא מתחרטת על שנייה" ומעט אחר כך סיפרה על בוקר שבו ישבה בשירותים ובכתה ולא רצתה לצאת. היא אמרה "אני מרגישה שאני שייכת" ובאותה נשימה "אני זרה שם, הוותיקות מסתכלות עליי כאילו אני ילדה". על החונכת אמרה "היא מדהימה, למדתי ממנה הכול", ומיד "אבל כשבאמת הייתי צריכה אותה, היא לא הייתה". הסתירות האלה הן לא בלבול. הן שני סיפורים שנשמעים בו זמנית, בסטריאו, כפי שגיליגן מתארת. מיכל גם אוהבת את המקום הזה וגם רוצה לברוח ממנו, ושתי האמיתות חיות בה יחד.</w:t>
+        <w:t>הראיון מלא בסתירות, ואני בחרתי לא ליישר אותן. רים אמרה "אני לא מתחרטת על שנייה" ומעט אחר כך סיפרה על בוקר שבו ישבה בשירותים ובכתה ולא רצתה לצאת. היא אמרה "אני מרגישה שאני שייכת" ובאותה נשימה "אני זרה שם, הוותיקות מסתכלות עליי כאילו אני בת קטנה". על החונכת אמרה "היא מדהימה, למדתי ממנה הכול", ומיד "אבל כשבאמת הייתי צריכה אותה, היא לא הייתה". הסתירות האלה הן לא בלבול. הן שני סיפורים שנשמעים בו זמנית, בסטריאו, כפי שגיליגן מתארת. רים גם אוהבת את המקום הזה וגם רוצה לברוח ממנו, ושתי האמיתות חיות בה יחד.</w:t>
       </w:r>
     </w:p>
     <w:p>
@@ -1227,7 +1227,7 @@
           <w:rFonts w:ascii="David" w:hAnsi="David" w:cs="David"/>
           <w:b/>
           <w:bCs/>
-          <w:color w:val="1A1A1A"/>
+          <w:color w:val="000000"/>
           <w:sz w:val="27"/>
           <w:szCs w:val="27"/>
           <w:rtl w:val="1"/>
@@ -1249,7 +1249,7 @@
           <w:szCs w:val="24"/>
           <w:rtl w:val="1"/>
         </w:rPr>
-        <w:t>נקודת המחאה הברורה ביותר עלתה סביב התכתיב של "המורה שלא מראה חולשה". מיכל סיפרה שרונית אמרה לה בתחילת השנה "אסור שהם יראו אותך נשברת, את חייבת להיות קשוחה", ושהיא, מיכל, החליטה בשלב מסוים לא לקבל את זה. "אני בכיתי פעם מול הילדים", היא אמרה, "וזה היה הרגע הכי טוב שלי איתם, הם ראו שאני בן אדם". יש כאן התנגדות מודעת לתכתיב על המורה הצעירה שצריכה להיות חזקה, אמא לכולם ולעולם לא זקוקה בעצמה. מיכל בוחרת אחרת, ומשלמת על זה מחיר של ביקורת מהצוות.</w:t>
+        <w:t>נקודות המחאה עלו בשני מקומות. הראשון הוא סביב התכתיב של "המורה שלא מראה חולשה". סועאד אמרה לרים בתחילת השנה "אסור שהם יראו אותך נשברת, את חייבת להיות קשוחה", ורים החליטה בשלב מסוים לא לקבל את זה. "אני בכיתי פעם מול הילדים", היא אמרה, "וזה היה הרגע הכי טוב שלי איתם, הם ראו שאני בן אדם". המקום השני, ועמוק לא פחות, הוא מחאה כנגד ההנחה שהיא בחרה בהוראה כי זה "מה שמתאים לבת". רים התעקשה שזאת לא ברירת מחדל בשבילה אלא שליחות אמיתית, ובזה היא מתנגדת לתכתיב שמכתיב לאישה ערבייה צעירה איזה מקצוע "מותר" לה לרצות. יש כאן התנגדות מודעת, והיא משלמת עליה מחיר של ביקורת, גם מהצוות וגם מהמשפחה.</w:t>
       </w:r>
     </w:p>
     <w:p>
@@ -1263,7 +1263,7 @@
           <w:rFonts w:ascii="David" w:hAnsi="David" w:cs="David"/>
           <w:b/>
           <w:bCs/>
-          <w:color w:val="1A1A1A"/>
+          <w:color w:val="000000"/>
           <w:sz w:val="27"/>
           <w:szCs w:val="27"/>
           <w:rtl w:val="1"/>
@@ -1285,7 +1285,7 @@
           <w:szCs w:val="24"/>
           <w:rtl w:val="1"/>
         </w:rPr>
-        <w:t>זיהיתי בטקסט כמה תמות שחוזרות שוב ושוב. הבולטת היא הבדידות, "אין למי", תחושת היחיד מול המערכת. תמה שנייה היא הפער בין הפנטזיה למציאות, בין מה שדמיינה למה שפגשה. תמה שלישית היא הכמיהה להכרה, הרצון שמישהו יראה כמה קשה היא עובדת. תמה רביעית היא העייפות והשחיקה הגופנית ממש, "אני מגיעה הביתה ריקה". תמה חמישית היא המשמעות, אותם רגעים עם התלמידים שבגללם היא נשארת. ותמה שישית, התכתיבים סביב "מורה טובה", שמלווים אותה כל הזמן ברקע.</w:t>
+        <w:t>זיהיתי בטקסט כמה תמות שחוזרות שוב ושוב. הבולטת היא הבדידות, "אין למי", תחושת היחיד מול המערכת. תמה שנייה היא הפער בין הפנטזיה למציאות, בין מה שדמיינה למה שפגשה. תמה שלישית היא הכמיהה להכרה, הרצון שמישהו יראה כמה קשה היא עובדת. תמה רביעית היא העייפות והשחיקה הגופנית ממש, "אני מגיעה הביתה ריקה". תמה חמישית היא המשמעות, אותם רגעים עם התלמידים שבגללם היא נשארת. ותמה שישית, התכתיבים החברתיים והמגדריים בחברה הערבית, סביב "מורה טובה" וסביב "בת טובה", שמלווים אותה כל הזמן ברקע.</w:t>
       </w:r>
     </w:p>
     <w:p>
@@ -1299,7 +1299,7 @@
           <w:rFonts w:ascii="David" w:hAnsi="David" w:cs="David"/>
           <w:b/>
           <w:bCs/>
-          <w:color w:val="1A1A1A"/>
+          <w:color w:val="000000"/>
           <w:sz w:val="27"/>
           <w:szCs w:val="27"/>
           <w:rtl w:val="1"/>
@@ -1321,7 +1321,7 @@
           <w:szCs w:val="24"/>
           <w:rtl w:val="1"/>
         </w:rPr>
-        <w:t>מה ששמעתי חיזק חלק ממה שידעתי מראש וגם ערער חלק. הוא חיזק את מה שלמדתי על שחיקה של מורים מתחילים ועל שיעורי הנשירה הגבוהים בשנים הראשונות. אבל הוא גם ערער הנחה שלי. באתי עם ההנחה שמורה מתחילה שסובלת כל כך רוצה בעיקר לעזוב, ומיכל לימדה אותי שאפשר לסבול ולרצות להישאר בו זמנית, ושהמשמעות והכאב לא סותרים אלא חיים יחד. זה לא הסתדר עם התמונה הפשטנית שהבאתי, זאת שבה או שסובלים או שנשארים.</w:t>
+        <w:t>מה ששמעתי חיזק חלק ממה שידעתי מראש וגם ערער חלק. הוא חיזק את מה שלמדתי על שחיקה של מורים מתחילים ועל הקשיים המיוחדים של מערכת החינוך הערבית, המשאבים החסרים והכיתות הצפופות. אבל הוא גם ערער הנחה שלי. באתי עם ההנחה שמורה מתחילה שסובלת כל כך רוצה בעיקר לעזוב, ורים לימדה אותי שאפשר לסבול ולרצות להישאר בו זמנית, ושהמשמעות והכאב לא סותרים אלא חיים יחד. וגם ההנחה שלי שהיא נדחפה להוראה בגלל החברה התבררה כשטחית, כי רים דווקא בחרה בזה מתוך רצון עמוק, וזה לא הסתדר עם התמונה הפשטנית שהבאתי איתי.</w:t>
       </w:r>
     </w:p>
     <w:p>
@@ -1335,7 +1335,7 @@
           <w:rFonts w:ascii="David" w:hAnsi="David" w:cs="David"/>
           <w:b/>
           <w:bCs/>
-          <w:color w:val="1A1A1A"/>
+          <w:color w:val="000000"/>
           <w:sz w:val="27"/>
           <w:szCs w:val="27"/>
           <w:rtl w:val="1"/>
@@ -1357,7 +1357,7 @@
           <w:szCs w:val="24"/>
           <w:rtl w:val="1"/>
         </w:rPr>
-        <w:t>שאלת המחקר שלי הייתה מהי חווייתן של מורות מתחילות בשנתן הראשונה. ניתוח הראיון לא שינה אותה, אלא חידד אותה. התובנה המרכזית שלי היא שהשנה הראשונה של מיכל היא חוויה של בדידות עמוקה בתוך מקום מלא אנשים. היא מוקפת בשלושים תלמידים, בצוות שלם, בחונכת ובמנהלת, ובכל זאת מרגישה שאין לה על מי להישען. הפער בין הפנטזיה למציאות הוא לא רק פער של עומס עבודה, הוא פער של תמיכה. מיכל לא נשברה מכובד העבודה בלבד, אלא מהתחושה שהיא נושאת אותו לבד.</w:t>
+        <w:t>שאלת המחקר שלי הייתה מהי חווייתן של מורות מתחילות במגזר הערבי בשנתן הראשונה. ניתוח הראיון לא שינה אותה, אלא חידד אותה. התובנה המרכזית שלי היא שהשנה הראשונה של רים היא חוויה של בדידות עמוקה בתוך מקום מלא אנשים. היא מוקפת בשלושים וחמישה תלמידים, בצוות שלם, בחונכת ובמנהל, בכפר שכולם בו מכירים אותה, ובכל זאת מרגישה שאין לה על מי להישען. הפער בין הפנטזיה למציאות הוא לא רק פער של עומס עבודה או של משאבים, הוא פער של תמיכה. רים לא נשברה מכובד העבודה בלבד, אלא מהתחושה שהיא נושאת אותו לבד, מול מערכת שחסרה לה ומול חברה שמצפה ממנה להיות חזקה בשקט.</w:t>
       </w:r>
     </w:p>
     <w:p>
@@ -1371,7 +1371,7 @@
           <w:rFonts w:ascii="David" w:hAnsi="David" w:cs="David"/>
           <w:b/>
           <w:bCs/>
-          <w:color w:val="1A1A1A"/>
+          <w:color w:val="000000"/>
           <w:sz w:val="27"/>
           <w:szCs w:val="27"/>
           <w:rtl w:val="1"/>
@@ -1393,7 +1393,7 @@
           <w:szCs w:val="24"/>
           <w:rtl w:val="1"/>
         </w:rPr>
-        <w:t>אילו יכולתי לחזור, הייתי שואלת יותר על החיים של מיכל מחוץ לבית הספר. כמעט לא נגעתי בבן הזוג, במשפחה, במה שקורה לה בערב אחרי יום כזה, ואני חושבת שדווקא שם מסתתר חלק גדול מהסיפור. הייתי גם רוצה לראיין מורות מתחילות נוספות, כדי לבדוק אם הבדידות הזאת היא של מיכל או של דור שלם.</w:t>
+        <w:t>אילו יכולתי לחזור, הייתי שואלת יותר על החיים של רים מחוץ לבית הספר. כמעט לא נגעתי בבעל, במשפחה, במה שקורה לה בערב אחרי יום כזה, ואני חושבת שדווקא שם מסתתר חלק גדול מהסיפור. הייתי גם רוצה לראיין מורות מתחילות נוספות מכפרים אחרים, כדי לבדוק אם הבדידות הזאת היא של רים או של דור שלם של מורות ערביות צעירות.</w:t>
       </w:r>
     </w:p>
     <w:p>
@@ -1407,7 +1407,7 @@
           <w:rFonts w:ascii="David" w:hAnsi="David" w:cs="David"/>
           <w:b/>
           <w:bCs/>
-          <w:color w:val="1F3A5F"/>
+          <w:color w:val="000000"/>
           <w:sz w:val="34"/>
           <w:szCs w:val="34"/>
           <w:rtl w:val="1"/>
@@ -1429,7 +1429,7 @@
           <w:szCs w:val="24"/>
           <w:rtl w:val="1"/>
         </w:rPr>
-        <w:t>שלחתי למיכל את התמליל ואת הניתוח, וביקשתי ממנה לקרוא ולהגיב. חיכיתי כמה ימים כי היא ביקשה זמן, ואז נפגשנו לקפה כדי לדבר על זה. אני מביאה כאן את עיקרי מה שאמרה, בעיקר במילים שלה.</w:t>
+        <w:t>שלחתי לרים את התמליל ואת הניתוח, וביקשתי ממנה לקרוא ולהגיב. חיכיתי כמה ימים כי היא ביקשה זמן, ואז נפגשנו לקפה בבית שלה כדי לדבר על זה. אני מביאה כאן את עיקרי מה שאמרה, בעיקר במילים שלה.</w:t>
       </w:r>
     </w:p>
     <w:p>
@@ -1446,7 +1446,7 @@
           <w:szCs w:val="24"/>
           <w:rtl w:val="1"/>
         </w:rPr>
-        <w:t>הדבר הראשון שהיא אמרה היה שהיה לה מוזר לקרוא את עצמה. "לא ידעתי שאני אומרת 'אין למי' כל כך הרבה פעמים", היא צחקה, "עכשיו אני שומעת את עצמי ואני כזה, וואו, אני באמת מרגישה ככה". היא אמרה שהניתוח תפס אותה במקום שהיא לא שמה לב אליו, דווקא בעניין הבדידות. "חשבתי שהבעיה שלי היא העומס", היא אמרה, "אבל את צודקת, זה לא העומס, זה שאני עושה את זה לבד".</w:t>
+        <w:t>הדבר הראשון שהיא אמרה היה שהיה לה מוזר לקרוא את עצמה. "לא ידעתי שאני אומרת 'אין למי' כל כך הרבה פעמים", היא צחקה, "עכשיו אני שומעת את עצמי ואני כזה, וואללה, אני באמת מרגישה ככה". היא אמרה שהניתוח תפס אותה במקום שהיא לא שמה לב אליו, דווקא בעניין הבדידות. "חשבתי שהבעיה שלי היא העומס והכיתות הצפופות", היא אמרה, "אבל את צודקת, זה לא רק זה, זה שאני עושה את זה לבד".</w:t>
       </w:r>
     </w:p>
     <w:p>
@@ -1463,7 +1463,7 @@
           <w:szCs w:val="24"/>
           <w:rtl w:val="1"/>
         </w:rPr>
-        <w:t>במקום אחד היא לא הסכימה איתי, וזה היה חשוב לי לשמוע. כתבתי שהיא כמעט לא הזכירה את בן הזוג, ורמזתי שהחיים הזוגיים נדחקו. מיכל אמרה שזה לא מדויק. "לא סיפרתי עליו כי הוא דווקא הדבר הכי יציב אצלי", היא הסבירה, "לא הרגשתי צורך לדבר עליו כי שם אני בסדר. דיברתי על מה שכואב". זה תיקן לי משהו בניתוח. ההיעדר לא תמיד מעיד על חוסר, לפעמים הוא מעיד דווקא על מקום שלם.</w:t>
+        <w:t>במקום אחד היא לא הסכימה איתי, וזה היה חשוב לי לשמוע. כתבתי שהיא כמעט לא הזכירה את בעלה, ורמזתי שהחיים הזוגיים נדחקו. רים אמרה שזה לא מדויק. "לא סיפרתי עליו כי הוא דווקא הדבר הכי יציב אצלי", היא הסבירה, "סאמי הוא הסלע שלי, לא הרגשתי צורך לדבר עליו כי שם אני בסדר. דיברתי על מה שכואב". זה תיקן לי משהו בניתוח. ההיעדר לא תמיד מעיד על חוסר, לפעמים הוא מעיד דווקא על מקום שלם.</w:t>
       </w:r>
     </w:p>
     <w:p>
@@ -1480,7 +1480,7 @@
           <w:szCs w:val="24"/>
           <w:rtl w:val="1"/>
         </w:rPr>
-        <w:t>לגבי קטע הבכי בשירותים, היא ביקשה שאשאיר אותו. "בהתחלה התביישתי שסיפרתי לך את זה", היא אמרה, "אבל כשקראתי הבנתי שזה בעצם הרגע הכי אמיתי בכל השיחה". היא סיימה ואמרה שהקריאה עשתה לה טוב, שזה כמו להסתכל על עצמך מבחוץ, ושהיא שמחה שהסכימה. יצאתי מהמפגש עם תחושה שהתהליך היה שלה לא פחות משהיה שלי.</w:t>
+        <w:t>לגבי קטע הבכי בשירותים, היא ביקשה שאשאיר אותו. "בהתחלה התביישתי שסיפרתי לך את זה", היא אמרה, "בכפר לא מספרים דברים כאלה, מה יגידו. אבל כשקראתי הבנתי שזה בעצם הרגע הכי אמיתי בכל השיחה". היא סיימה ואמרה שהקריאה עשתה לה טוב, שזה כמו להסתכל על עצמך מבחוץ, ושהיא שמחה שהסכימה. יצאתי מהמפגש עם תחושה שהתהליך היה שלה לא פחות משהיה שלי.</w:t>
       </w:r>
     </w:p>
     <w:p>
@@ -1494,7 +1494,7 @@
           <w:rFonts w:ascii="David" w:hAnsi="David" w:cs="David"/>
           <w:b/>
           <w:bCs/>
-          <w:color w:val="1F3A5F"/>
+          <w:color w:val="000000"/>
           <w:sz w:val="34"/>
           <w:szCs w:val="34"/>
           <w:rtl w:val="1"/>
@@ -1516,7 +1516,7 @@
           <w:szCs w:val="24"/>
           <w:rtl w:val="1"/>
         </w:rPr>
-        <w:t>קשה לי להפריד בין מה שלמדתי על מיכל לבין מה שלמדתי על עצמי. נכנסתי לראיון הזה עם פחד, והפחד הזה לא נעלם, אבל הוא השתנה. ישבתי מולה ושמעתי אישה שדומה לי, קצת יותר מבוגרת, שכבר עברה את מה שאני עומדת לעבור, ובמקום להירגע נהייתי דרוכה. חלק ממני רצה שהיא תגיד לי שזה נורא, כדי שאדע שהפחד שלי מוצדק. וחלק ממני רצה שהיא תגיד שהכול יהיה בסדר. היא לא עשתה אף אחד מהשניים, והאמת שדווקא זה עזר לי.</w:t>
+        <w:t>קשה לי להפריד בין מה שלמדתי על רים לבין מה שלמדתי על עצמי. נכנסתי לראיון הזה עם פחד, והפחד הזה לא נעלם, אבל הוא השתנה. ישבתי מולה ושמעתי אישה שדומה לי, ערבייה, קצת יותר מבוגרת, שכבר עברה את מה שאני עומדת לעבור, ובמקום להירגע נהייתי דרוכה. חלק ממני רצה שהיא תגיד לי שזה נורא, כדי שאדע שהפחד שלי מוצדק. וחלק ממני רצה שהיא תגיד שהכול יהיה בסדר. היא לא עשתה אף אחד מהשניים, והאמת שדווקא זה עזר לי.</w:t>
       </w:r>
     </w:p>
     <w:p>
@@ -1533,7 +1533,7 @@
           <w:szCs w:val="24"/>
           <w:rtl w:val="1"/>
         </w:rPr>
-        <w:t>במהלך הראיון היו רגעים שהיה לי קשה. כשמיכל בכתה כשסיפרה על עומר, הילד שסירבו להעביר לו אבחון, לא ידעתי מה לעשות עם עצמי. שתקתי. אחר כך חשבתי שאולי השתיקה שלי הייתה נכונה, שנתתי לה מקום, אבל בזמן אמת הרגשתי חוסר אונים. למדתי שראיון הוא לא רק לשאול שאלות. הוא גם להיות שם, לשאת את הרגש של מישהי אחרת בלי לברוח ממנו, וזה קשה יותר ממה שחשבתי.</w:t>
+        <w:t>במהלך הראיון היו רגעים שהיה לי קשה. כשרים בכתה כשסיפרה על כרים, הילד שסירבו להעביר לו אבחון, לא ידעתי מה לעשות עם עצמי. שתקתי. אחר כך חשבתי שאולי השתיקה שלי הייתה נכונה, שנתתי לה מקום, אבל בזמן אמת הרגשתי חוסר אונים. למדתי שראיון הוא לא רק לשאול שאלות. הוא גם להיות שם, לשאת את הרגש של מישהי אחרת בלי לברוח ממנו, וזה קשה יותר ממה שחשבתי.</w:t>
       </w:r>
     </w:p>
     <w:p>
@@ -1567,7 +1567,24 @@
           <w:szCs w:val="24"/>
           <w:rtl w:val="1"/>
         </w:rPr>
-        <w:t>לגבי הנושא עצמו, אני יוצאת פחות בטוחה בהנחות שהבאתי. באתי עם סיפור מוכן בראש, על מערכת שזורקת מורות למים, ומיכל סיבכה לי אותו. היא באמת סובלת, וגם באמת אוהבת. היא כועסת על המערכת, וגם מרגישה שם בבית. אני לא יכולה יותר לספר את הסיפור הפשוט שרציתי לספר, וזה טוב. אני חושבת שנכנסתי לזה כדי לאשר משהו שכבר ידעתי, ויצאתי עם יותר שאלות מתשובות. אולי זה בדיוק העניין.</w:t>
+        <w:t>ומשהו על הזהות שלי. נכנסתי בטוחה שאני ורים "מאותו מקום", שתינו ערביות, שתינו מהכפר, ולכן אני אבין אותה מיד. ובאמצע הבנתי שזאת בדיוק ההנחה שהזהירו אותנו מפניה בשיעור הראשון, ההנחה שאני מבינה תרבות של אחר רק כי היא קרובה אליי. רים היא לא אני. היא נשואה, היא כבר בפנים, היא מכפר אחר עם דינמיקה אחרת. הייתי צריכה להזכיר לעצמי שוב ושוב להקשיב לה, לא לסיפור שכבר היה לי בראש עליה.</w:t>
+      </w:r>
+    </w:p>
+    <w:p>
+      <w:pPr>
+        <w:bidi/>
+        <w:spacing w:after="160" w:before="0" w:line="360" w:lineRule="auto"/>
+        <w:jc w:val="both"/>
+      </w:pPr>
+      <w:r>
+        <w:rPr>
+          <w:rFonts w:ascii="David" w:hAnsi="David" w:cs="David"/>
+          <w:b w:val="0"/>
+          <w:sz w:val="24"/>
+          <w:szCs w:val="24"/>
+          <w:rtl w:val="1"/>
+        </w:rPr>
+        <w:t>לגבי הנושא עצמו, אני יוצאת פחות בטוחה בהנחות שהבאתי. באתי עם סיפור מוכן בראש, על מערכת שזורקת מורות למים ועל חברה שמכתיבה להן את הדרך, ורים סיבכה לי אותו. היא באמת סובלת, וגם באמת אוהבת. היא כועסת על המערכת, וגם מרגישה שם בבית. אני לא יכולה יותר לספר את הסיפור הפשוט שרציתי לספר, וזה טוב. אני חושבת שנכנסתי לזה כדי לאשר משהו שכבר ידעתי, ויצאתי עם יותר שאלות מתשובות. אולי זה בדיוק העניין.</w:t>
       </w:r>
     </w:p>
     <w:p>
@@ -1589,7 +1606,7 @@
           <w:rFonts w:ascii="David" w:hAnsi="David" w:cs="David"/>
           <w:b/>
           <w:bCs/>
-          <w:color w:val="1F3A5F"/>
+          <w:color w:val="000000"/>
           <w:sz w:val="34"/>
           <w:szCs w:val="34"/>
           <w:rtl w:val="1"/>
@@ -1611,7 +1628,7 @@
           <w:szCs w:val="24"/>
           <w:rtl w:val="1"/>
         </w:rPr>
-        <w:t>הראיון נערך בביתה של מיכל, בערב של יום חול, ונמשך כשעה. מיכל היא מורה מתחילה בת עשרים ושבע, מלמדת כיתה ג' בבית ספר יסודי בדרום. השמות של המרואיינת ושל האנשים שהיא מזכירה שונו לשם שמירה על פרטיות. סימנתי בסוגריים שתיקות, צחוק, בכי ומחוות אחרות כפי שהתרחשו.</w:t>
+        <w:t>הראיון נערך בביתה של רים, בערב של יום חול, ונמשך כשעה. הוא נערך בערבית, בשפת האם של שתינו, ותרגמתי אותו לעברית לצורך העבודה. השארתי כמה ביטויים בערבית במקומם, כי לא מצאתי להם תרגום שנשמע נכון. רים היא מורה מתחילה בת עשרים ושבע, מלמדת כיתה ג' בבית ספר יסודי בכפר בגליל. השמות של המרואיינת ושל האנשים שהיא מזכירה שונו לשם שמירה על פרטיות. סימנתי בסוגריים שתיקות, צחוק, בכי ומחוות אחרות כפי שהתרחשו.</w:t>
       </w:r>
     </w:p>
     <w:p>
@@ -1657,7 +1674,7 @@
           <w:szCs w:val="24"/>
           <w:rtl w:val="1"/>
         </w:rPr>
-        <w:t xml:space="preserve">מיכל: </w:t>
+        <w:t xml:space="preserve">רים: </w:t>
       </w:r>
       <w:r>
         <w:rPr>
@@ -1667,7 +1684,7 @@
           <w:szCs w:val="24"/>
           <w:rtl w:val="1"/>
         </w:rPr>
-        <w:t>אוקיי. אז אני מיכל, בת עשרים ושבע, אני מלמדת כיתה ג' בבית ספר בדרום, זאת השנה הראשונה המלאה שלי. איך הגעתי... (חושבת) האמת שתמיד ידעתי שאני רוצה ללמד. מגיל קטן שיחקתי מורה עם הבובות, זה נשמע קלישאה אבל זה נכון. הייתה לי מורה בכיתה ד', המורה רותי, שממש שינתה לי את החיים, והחלטתי שאני רוצה להיות כמוה.</w:t>
+        <w:t>אוקיי. אז אני רים, בת עשרים ושבע, אני מלמדת כיתה ג' בבית ספר בכפר, זאת השנה הראשונה המלאה שלי. איך הגעתי... (חושבת) האמת שבבית תמיד אמרו לי "את תהיי מורה", כאילו זה כבר סגור. אבל גם אני רציתי, זה לא שכפו עליי. הייתה לי מורה בכיתה ד', המורה עביר, שממש שינתה לי את החיים, והחלטתי שאני רוצה להיות כמוה. אז זה גם מה שרצו ממני וגם מה שאני רציתי, שני הדברים ביחד.</w:t>
       </w:r>
     </w:p>
     <w:p>
@@ -1713,7 +1730,7 @@
           <w:szCs w:val="24"/>
           <w:rtl w:val="1"/>
         </w:rPr>
-        <w:t xml:space="preserve">מיכל: </w:t>
+        <w:t xml:space="preserve">רים: </w:t>
       </w:r>
       <w:r>
         <w:rPr>
@@ -1723,7 +1740,7 @@
           <w:szCs w:val="24"/>
           <w:rtl w:val="1"/>
         </w:rPr>
-        <w:t>(צוחקת) אוי. דמיינתי משהו אחר לגמרי. דמיינתי כיתה של ילדים שמחכים לי, שאני נכנסת והם מקשיבים, ואני עושה שיעורים יצירתיים ומדליקים והם אוהבים ללמוד. דמיינתי שאני אהיה המורה רותי של מישהו. זה מה שהחזיק אותי בכל הלימודים. (שתיקה קצרה) ואז הגעתי.</w:t>
+        <w:t>(צוחקת) יא אללה. דמיינתי משהו אחר לגמרי. דמיינתי כיתה של ילדים שמחכים לי, שאני נכנסת והם מקשיבים, ואני עושה שיעורים יפים ומעניינים והם אוהבים ללמוד. דמיינתי שאני אהיה המורה עביר של מישהו. זה מה שהחזיק אותי בכל הלימודים. (שתיקה קצרה) ואז הגעתי.</w:t>
       </w:r>
     </w:p>
     <w:p>
@@ -1769,7 +1786,7 @@
           <w:szCs w:val="24"/>
           <w:rtl w:val="1"/>
         </w:rPr>
-        <w:t xml:space="preserve">מיכל: </w:t>
+        <w:t xml:space="preserve">רים: </w:t>
       </w:r>
       <w:r>
         <w:rPr>
@@ -1779,7 +1796,7 @@
           <w:szCs w:val="24"/>
           <w:rtl w:val="1"/>
         </w:rPr>
-        <w:t>היום הראשון... זה כאילו זרקו אותי למים העמוקים ואמרו לי תשחי. אני זוכרת שעמדתי מול הכיתה ופתאום שלושים זוגות עיניים מסתכלים עליי ואני לא יודעת מה לעשות עם הידיים שלי. הכנתי שיעור ליומיים והוא נגמר בעשרים דקות. ואז נשארו לי עוד חמש שעות ואני כזה... מה עכשיו? (צוחקת) הם התחילו לטפס על הקירות ואני צעקתי, וזה היה נורא, כי הבטחתי לעצמי שאני לא אהיה מורה שצועקת. וביום הראשון כבר צעקתי.</w:t>
+        <w:t>היום הראשון... זה כאילו זרקו אותי למים ומי שלא יודע לשחות, טובע. אני זוכרת שעמדתי מול הכיתה ופתאום שלושים וחמישה זוגות עיניים מסתכלים עליי ואני לא יודעת מה לעשות עם הידיים שלי. הכנתי שיעור ליומיים והוא נגמר בעשרים דקות. ואז נשארו לי עוד חמש שעות ואני כזה... שו הלק, מה עכשיו? (צוחקת) הם התחילו לטפס על הקירות ואני צעקתי, וזה היה נורא, כי הבטחתי לעצמי שאני לא אהיה מורה שצועקת. וביום הראשון כבר צעקתי.</w:t>
       </w:r>
     </w:p>
     <w:p>
@@ -1825,7 +1842,7 @@
           <w:szCs w:val="24"/>
           <w:rtl w:val="1"/>
         </w:rPr>
-        <w:t xml:space="preserve">מיכל: </w:t>
+        <w:t xml:space="preserve">רים: </w:t>
       </w:r>
       <w:r>
         <w:rPr>
@@ -1835,7 +1852,7 @@
           <w:szCs w:val="24"/>
           <w:rtl w:val="1"/>
         </w:rPr>
-        <w:t>די מהר. אולי בשבוע השני. הייתה לי ילדה, נטע, שפשוט לא הפסיקה לבכות, כל יום, ולא הצלחתי להבין למה. וניסיתי הכול, וכלום לא עבד, והרגשתי כישלון מוחלט. בלימודים לימדו אותנו על "אקלים כיתתי מיטבי" ועל "הכלה", מילים יפות, אבל אף אחד לא אמר לי מה עושים כשילדה בת שמונה בוכה ואת לא יודעת למה ואת לבד בכיתה. (שתיקה) שם הבנתי שהדמיון והמציאות זה שני דברים.</w:t>
+        <w:t>די מהר. אולי בשבוע השני. הייתה לי ילדה, לין, שפשוט לא הפסיקה לבכות, כל יום, ולא הצלחתי להבין למה. וניסיתי הכול, וכלום לא עבד, והרגשתי כישלון מוחלט. בלימודים לימדו אותנו על "אקלים כיתתי מיטבי" ועל "הכלה", מילים יפות, אבל אף אחד לא אמר לי מה עושים כשילדה בת שמונה בוכה ואת לא יודעת למה ואת לבד בכיתה עם עוד שלושים וארבעה ילדים. (שתיקה) שם הבנתי שהדמיון והמציאות זה שני דברים.</w:t>
       </w:r>
     </w:p>
     <w:p>
@@ -1881,7 +1898,7 @@
           <w:szCs w:val="24"/>
           <w:rtl w:val="1"/>
         </w:rPr>
-        <w:t xml:space="preserve">מיכל: </w:t>
+        <w:t xml:space="preserve">רים: </w:t>
       </w:r>
       <w:r>
         <w:rPr>
@@ -1891,7 +1908,7 @@
           <w:szCs w:val="24"/>
           <w:rtl w:val="1"/>
         </w:rPr>
-        <w:t>קמה בשש, בשבע אני כבר בבית ספר. שש שעות הוראה כמעט בלי הפסקה אמיתית, כי גם בהפסקה יש תורנות או ילד שצריך משהו. אחר הצהריים בדיקת מבחנים, הכנת שיעורים, ווטסאפ של הורים שלא נגמר. אני עונה להורים בעשר בלילה, זה נהיה נורמלי אצלי. (נאנחת) אני מגיעה הביתה ריקה. ממש ריקה. אין לי כוח לדבר עם אף אחד. בן הזוג שלי כבר יודע שבערב עדיף לא לשאול אותי יותר מדי.</w:t>
+        <w:t>קמה בשש, בשבע אני כבר בבית ספר. שש שעות הוראה כמעט בלי הפסקה אמיתית, כי גם בהפסקה יש תורנות או ילד שצריך משהו. אחר הצהריים בדיקת מבחנים, הכנת שיעורים, ווטסאפ של הורים שלא נגמר. אני עונה להורים בעשר בלילה, זה נהיה נורמלי אצלי. (נאנחת) אני מגיעה הביתה ריקה. ממש ריקה. אין לי כוח לדבר עם אף אחד. בעלי סאמי כבר יודע שבערב עדיף לא לשאול אותי יותר מדי.</w:t>
       </w:r>
     </w:p>
     <w:p>
@@ -1937,7 +1954,7 @@
           <w:szCs w:val="24"/>
           <w:rtl w:val="1"/>
         </w:rPr>
-        <w:t xml:space="preserve">מיכל: </w:t>
+        <w:t xml:space="preserve">רים: </w:t>
       </w:r>
       <w:r>
         <w:rPr>
@@ -1947,7 +1964,7 @@
           <w:szCs w:val="24"/>
           <w:rtl w:val="1"/>
         </w:rPr>
-        <w:t>(שתיקה ארוכה) הבדידות. זה הכי קשה. לא העומס, את יודעת, לעומס אפשר להתרגל. הבדידות. שאת עומדת מול הכול לבד ואין למי לפנות. בחדר מורים כולם ותיקים, כולם מכירים אחד את השני עשרים שנה, ואני יושבת בפינה עם הקפה שלי וזהו. אין למי לספר שהיה לי יום קשה. אין למי להגיד "תשמעי מה קרה לי היום". פעם אחת ניסיתי לספר למורה ותיקה על משהו קשה שקרה לי, והיא אמרה לי "את עוד תתרגלי, כולנו עברנו את זה", והלכה. וזהו. הרגשתי כזה קטנה.</w:t>
+        <w:t>(שתיקה ארוכה) הבדידות. זה הכי קשה. לא העומס, את יודעת, לעומס אפשר להתרגל, גם לכיתות הצפופות. הבדידות. שאת עומדת מול הכול לבד ואין למי לפנות. בחדר מורים כולן ותיקות, כולן מכירות אחת את השנייה עשרים שנה, חלקן לימדו אותי כשהייתי ילדה, ואני יושבת בפינה עם הקפה שלי וזהו. אין למי לספר שהיה לי יום קשה. אין למי להגיד "תשמעי מה קרה לי היום". פעם אחת ניסיתי לספר למורה ותיקה על משהו קשה, והיא אמרה לי "את עוד תתרגלי, כולנו עברנו את זה", והלכה. וזהו. הרגשתי כזה קטנה.</w:t>
       </w:r>
     </w:p>
     <w:p>
@@ -1993,7 +2010,7 @@
           <w:szCs w:val="24"/>
           <w:rtl w:val="1"/>
         </w:rPr>
-        <w:t xml:space="preserve">מיכל: </w:t>
+        <w:t xml:space="preserve">רים: </w:t>
       </w:r>
       <w:r>
         <w:rPr>
@@ -2003,7 +2020,7 @@
           <w:szCs w:val="24"/>
           <w:rtl w:val="1"/>
         </w:rPr>
-        <w:t>זה בודד. יש ימים שאני פשוט מרגישה שאני טובעת, ואין אף אחד שיושיט יד. אצלנו בדרום גם אין למי לברוח, אין עשרה בתי ספר אחרים לעבור אליהם, זה מה שיש. אז את נשארת וטובעת בשקט.</w:t>
+        <w:t>זה בודד. יש ימים שאני פשוט מרגישה שאני טובעת, ואין אף אחד שיושיט יד. ואצלנו בכפר כולם מכירים את כולם, אין לאן לברוח, אם בוכה לך העין באמצע היום כולם יידעו עד הערב. אז את נשארת וטובעת בשקט, ומחייכת בחוץ.</w:t>
       </w:r>
     </w:p>
     <w:p>
@@ -2049,7 +2066,7 @@
           <w:szCs w:val="24"/>
           <w:rtl w:val="1"/>
         </w:rPr>
-        <w:t xml:space="preserve">מיכל: </w:t>
+        <w:t xml:space="preserve">רים: </w:t>
       </w:r>
       <w:r>
         <w:rPr>
@@ -2059,7 +2076,7 @@
           <w:szCs w:val="24"/>
           <w:rtl w:val="1"/>
         </w:rPr>
-        <w:t>(מחייכת) הילדים. זה נשמע צפוי אבל זה הם. יש רגעים... יש ילד אחד, עומר קוראים לו, וזה סיפור אחר לגמרי. (שתיקה)</w:t>
+        <w:t>(מחייכת) הילדים. אלחמדוללה עליהם. זה נשמע צפוי אבל זה הם. יש רגעים... יש ילד אחד, כרים קוראים לו, וזה סיפור אחר לגמרי. (שתיקה)</w:t>
       </w:r>
     </w:p>
     <w:p>
@@ -2105,7 +2122,7 @@
           <w:szCs w:val="24"/>
           <w:rtl w:val="1"/>
         </w:rPr>
-        <w:t xml:space="preserve">מיכל: </w:t>
+        <w:t xml:space="preserve">רים: </w:t>
       </w:r>
       <w:r>
         <w:rPr>
@@ -2115,7 +2132,7 @@
           <w:szCs w:val="24"/>
           <w:rtl w:val="1"/>
         </w:rPr>
-        <w:t>עומר הגיע אליי בהתחלת השנה, ילד שכולם אמרו עליו שהוא "בעייתי", שהוא לא מקשיב, מפריע, אלים קצת. וראיתי ילד אחר. ראיתי ילד שפשוט אף אחד לא באמת הסתכל עליו. התחלתי לשבת איתו כל בוקר חמש דקות לפני השיעור, רק לדבר, על כדורגל, על מה שהוא רוצה. ולאט לאט הוא נפתח. (קולה נשבר) סליחה. (שתיקה, מוחה דמעות) הוא התחיל להביא לי ציורים. ילד שכולם ויתרו עליו. ואני ניסיתי להעביר לו אבחון כי ראיתי שיש שם משהו, קושי בקריאה, וסירבו לי. אמרו שאין תקציב, שיש ילדים לפניו בתור. וזה שבר אותי. כי אני יודעת שאם לא יתפסו את זה עכשיו, בעוד שנתיים הוא יהיה ילד אבוד, ואני לא יכולה לעשות כלום. (בוכה)</w:t>
+        <w:t>כרים הגיע אליי בהתחלת השנה, ילד שכולם אמרו עליו שהוא "בעייתי", שהוא לא מקשיב, מפריע, קצת אלים. וראיתי ילד אחר. ראיתי ילד שפשוט אף אחד לא באמת הסתכל עליו. הבית שלו קשה, אבא בחו"ל בעבודה, אמא לבד עם חמישה. התחלתי לשבת איתו כל בוקר חמש דקות לפני השיעור, רק לדבר, על כדורגל, על מה שהוא רוצה. ולאט לאט הוא נפתח. (קולה נשבר) סליחה. (שתיקה, מוחה דמעות) הוא התחיל להביא לי ציורים. ילד שכולם ויתרו עליו. ואני ניסיתי להעביר לו אבחון כי ראיתי שיש שם משהו, קושי בקריאה, וסירבו לי. אמרו שאין תקציב, שיש ילדים לפניו בתור, שבמגזר שלנו ממילא אין מספיק. וזה שבר אותי. כי אני יודעת שאם לא יתפסו את זה עכשיו, בעוד שנתיים הוא יהיה ילד אבוד, ואני לא יכולה לעשות כלום. (בוכה)</w:t>
       </w:r>
     </w:p>
     <w:p>
@@ -2161,7 +2178,7 @@
           <w:szCs w:val="24"/>
           <w:rtl w:val="1"/>
         </w:rPr>
-        <w:t xml:space="preserve">מיכל: </w:t>
+        <w:t xml:space="preserve">רים: </w:t>
       </w:r>
       <w:r>
         <w:rPr>
@@ -2217,7 +2234,7 @@
           <w:szCs w:val="24"/>
           <w:rtl w:val="1"/>
         </w:rPr>
-        <w:t xml:space="preserve">מיכל: </w:t>
+        <w:t xml:space="preserve">רים: </w:t>
       </w:r>
       <w:r>
         <w:rPr>
@@ -2227,7 +2244,7 @@
           <w:szCs w:val="24"/>
           <w:rtl w:val="1"/>
         </w:rPr>
-        <w:t>(מהססת) מרוחקים. אני מרגישה זרה שם. הוותיקות מסתכלות עליי כאילו אני ילדה, כאילו אני לא באמת מורה עדיין. יש ביניהן חוכמה, אני לא מזלזלת, אבל הן סגורות. יש קליקה, ואני בחוץ. אני זוכרת שבמסיבת חנוכה של הצוות ישבתי וכולן דיברו על דברים מלפני עשר שנים ואני פשוט חייכתי ולא הבנתי על מה מדברים. הרגשתי לגמרי לבד בתוך חדר מלא אנשים.</w:t>
+        <w:t>(מהססת) מרוחקים. אני מרגישה זרה שם. הוותיקות מסתכלות עליי כאילו אני בת קטנה, כאילו אני לא באמת מורה עדיין. יש ביניהן חוכמה, אני לא מזלזלת, אבל הן סגורות. יש קליקה, ואני בחוץ. אני זוכרת שבחתונה של הבת של אחת המורות ישבתי בשולחן וכולן דיברו על דברים מלפני עשר שנים ואני פשוט חייכתי ולא הבנתי על מה מדברים. הרגשתי לגמרי לבד בתוך אולם מלא אנשים שאני מכירה.</w:t>
       </w:r>
     </w:p>
     <w:p>
@@ -2273,7 +2290,7 @@
           <w:szCs w:val="24"/>
           <w:rtl w:val="1"/>
         </w:rPr>
-        <w:t xml:space="preserve">מיכל: </w:t>
+        <w:t xml:space="preserve">רים: </w:t>
       </w:r>
       <w:r>
         <w:rPr>
@@ -2283,7 +2300,7 @@
           <w:szCs w:val="24"/>
           <w:rtl w:val="1"/>
         </w:rPr>
-        <w:t>יש, רונית. והיחסים איתה זה סיפור מסובך. מצד אחד היא מדהימה, היא מורה מעולה, למדתי ממנה המון על ניהול כיתה, על איך לתכנן שיעור. אני ממש מעריכה אותה. (שתיקה) אבל.</w:t>
+        <w:t>יש, סועאד. והיחסים איתה זה סיפור מסובך. מצד אחד היא מדהימה, היא מורה מעולה, למדתי ממנה המון על ניהול כיתה, על איך לתכנן שיעור. אני ממש מעריכה אותה. (שתיקה) בס.</w:t>
       </w:r>
     </w:p>
     <w:p>
@@ -2329,7 +2346,7 @@
           <w:szCs w:val="24"/>
           <w:rtl w:val="1"/>
         </w:rPr>
-        <w:t xml:space="preserve">מיכל: </w:t>
+        <w:t xml:space="preserve">רים: </w:t>
       </w:r>
       <w:r>
         <w:rPr>
@@ -2385,7 +2402,7 @@
           <w:szCs w:val="24"/>
           <w:rtl w:val="1"/>
         </w:rPr>
-        <w:t xml:space="preserve">מיכל: </w:t>
+        <w:t xml:space="preserve">רים: </w:t>
       </w:r>
       <w:r>
         <w:rPr>
@@ -2395,7 +2412,7 @@
           <w:szCs w:val="24"/>
           <w:rtl w:val="1"/>
         </w:rPr>
-        <w:t>בהתחלה קיבלתי את זה. ניסיתי להיות קשוחה, להסתיר, לא להראות שום דבר. וזה עשה לי רע. הרגשתי מזויפת. ואז יום אחד, אחרי כל הסיפור עם עומר, לא החזקתי ובכיתי מול הכיתה. פשוט בכיתי. וחשבתי שזהו, הרסתי הכול, עכשיו הם לא יכבדו אותי. (שתיקה) וקרה ההפך. הם התקרבו אליי. אחת הילדות באה וחיבקה אותי. ומאותו רגע הבנתי שרונית טעתה. שדווקא כשהם ראו שאני בן אדם, נוצר משהו אמיתי. אז לא, אני לא מסכימה עם ה"תהיי קשוחה". זאת לא אני.</w:t>
+        <w:t>בהתחלה קיבלתי את זה. ניסיתי להיות קשוחה, להסתיר, לא להראות שום דבר. וזה עשה לי רע. הרגשתי מזויפת. ואז יום אחד, אחרי כל הסיפור עם כרים, לא החזקתי ובכיתי מול הכיתה. פשוט בכיתי. וחשבתי שזהו, הרסתי הכול, עכשיו הם לא יכבדו אותי. (שתיקה) וקרה ההפך. הם התקרבו אליי. אחת הבנות באה וחיבקה אותי. ומאותו רגע הבנתי שסועאד טעתה. שדווקא כשהם ראו שאני בן אדם, נוצר משהו אמיתי. אז לא, אני לא מסכימה עם ה"תהיי קשוחה". זאת לא אני.</w:t>
       </w:r>
     </w:p>
     <w:p>
@@ -2423,7 +2440,7 @@
           <w:szCs w:val="24"/>
           <w:rtl w:val="1"/>
         </w:rPr>
-        <w:t>מה היחס של המנהלת אלייך?</w:t>
+        <w:t>מה היחס של המנהל אלייך?</w:t>
       </w:r>
     </w:p>
     <w:p>
@@ -2441,7 +2458,7 @@
           <w:szCs w:val="24"/>
           <w:rtl w:val="1"/>
         </w:rPr>
-        <w:t xml:space="preserve">מיכל: </w:t>
+        <w:t xml:space="preserve">רים: </w:t>
       </w:r>
       <w:r>
         <w:rPr>
@@ -2451,7 +2468,7 @@
           <w:szCs w:val="24"/>
           <w:rtl w:val="1"/>
         </w:rPr>
-        <w:t>המנהלת... נוכחת אבל רחוקה. היא נחמדה, אומרת שלום, אבל היא עסוקה בתקציבים ובמשרד החינוך ובאלף דברים. פעם אחת היא נכנסה לצפות לי בשיעור, לא הודיעה מראש, וישבה בסוף עם דף וסימנה. אחר כך אמרה לי "יופי, רק תעבדי על משמעת". וזהו. לא שאלה מה שלומי, איך אני מסתדרת. בשבילה אני מספר, מורה בשנה ראשונה שצריך שתעבור את השנה.</w:t>
+        <w:t>המנהל... נוכח אבל רחוק. הוא מבוגר, מכובד בכפר, כולם קמים כשהוא נכנס. הוא נחמד, אומר שלום, אבל הוא עסוק בתקציבים ובמשרד החינוך ובאלף דברים. פעם אחת הוא נכנס לצפות לי בשיעור, לא הודיע מראש, וישב בסוף עם דף וסימן. אחר כך אמר לי "יופי, רק תעבדי על המשמעת". וזהו. לא שאל מה שלומי, איך אני מסתדרת. בשבילו אני מספר, מורה בשנה ראשונה שצריך שתעבור את השנה. ואני חושבת שגם קצת מוזר לו, אישה צעירה, הוא לא ממש יודע איך לדבר איתי.</w:t>
       </w:r>
     </w:p>
     <w:p>
@@ -2497,7 +2514,7 @@
           <w:szCs w:val="24"/>
           <w:rtl w:val="1"/>
         </w:rPr>
-        <w:t xml:space="preserve">מיכל: </w:t>
+        <w:t xml:space="preserve">רים: </w:t>
       </w:r>
       <w:r>
         <w:rPr>
@@ -2507,7 +2524,7 @@
           <w:szCs w:val="24"/>
           <w:rtl w:val="1"/>
         </w:rPr>
-        <w:t>(שתיקה) כן. היה בוקר אחד, אחרי הסירוב לאבחון של עומר, שנכנסתי לבית ספר ופשוט לא יכולתי. נכנסתי לשירותים של המורים וישבתי שם ובכיתי, ולא רציתי לצאת. הצלצול צלצל ואני עוד בשירותים. חשבתי, אני לא יכולה יותר, אני מתפטרת היום. (שתיקה) ואז יצאתי, שטפתי פנים, ונכנסתי לכיתה, כי מה, אני אשאיר אותם לבד? ועברתי את היום. אבל היה רגע שממש, ממש רציתי לקום וללכת ולא לחזור.</w:t>
+        <w:t>(שתיקה) כן. היה בוקר אחד, אחרי הסירוב לאבחון של כרים, שנכנסתי לבית ספר ופשוט לא יכולתי. נכנסתי לשירותים של המורים וישבתי שם ובכיתי, ולא רציתי לצאת. הצלצול צלצל ואני עוד בשירותים. חשבתי, אני לא יכולה יותר, אני מתפטרת היום. (שתיקה) ואז יצאתי, שטפתי פנים, ונכנסתי לכיתה, כי מה, אני אשאיר אותם לבד? ועברתי את היום. אבל היה רגע שממש, ממש רציתי לקום וללכת ולא לחזור.</w:t>
       </w:r>
     </w:p>
     <w:p>
@@ -2553,7 +2570,7 @@
           <w:szCs w:val="24"/>
           <w:rtl w:val="1"/>
         </w:rPr>
-        <w:t xml:space="preserve">מיכל: </w:t>
+        <w:t xml:space="preserve">רים: </w:t>
       </w:r>
       <w:r>
         <w:rPr>
@@ -2591,7 +2608,7 @@
           <w:szCs w:val="24"/>
           <w:rtl w:val="1"/>
         </w:rPr>
-        <w:t>בהחלט יכול. מה אנשים סביבך אומרים לך על העבודה?</w:t>
+        <w:t>בהחלט יכול. מה אנשים סביבך, במשפחה ובכפר, אומרים לך על העבודה?</w:t>
       </w:r>
     </w:p>
     <w:p>
@@ -2609,7 +2626,7 @@
           <w:szCs w:val="24"/>
           <w:rtl w:val="1"/>
         </w:rPr>
-        <w:t xml:space="preserve">מיכל: </w:t>
+        <w:t xml:space="preserve">רים: </w:t>
       </w:r>
       <w:r>
         <w:rPr>
@@ -2619,7 +2636,7 @@
           <w:szCs w:val="24"/>
           <w:rtl w:val="1"/>
         </w:rPr>
-        <w:t>אמא שלי הכי גאה בעולם, היא מספרת לכל השכונה שהבת שלה מורה. אבל היא גם אומרת לי כל הזמן "את נראית עייפה, את בטוחה שזה שווה את זה בכסף הזה?". החברים שלי, חלקם הלכו להייטק, ומרוויחים פי שלושה ממני, ולפעמים כשאני שומעת אותם אני כזה, מה אני עושה עם החיים שלי. אבל אז אני נזכרת בעומר. בן הזוג שלי דווקא מאוד תומך, הוא הבן אדם שהכי מחזיק אותי, אבל אני לא תמיד מספרת לו כמה קשה כי אני לא רוצה להעמיס.</w:t>
+        <w:t>אמא שלי הכי גאה בעולם, מאשאללה, היא מספרת לכל השכנות שהבת שלה מורה. אבל היא גם אומרת לי כל הזמן "את נראית עייפה, מתי אתם חושבים על ילדים כבר?", כאילו זה מובן מאליו שעכשיו תורי. ובכפר, את יודעת, אישה בת עשרים ושבע, נשואה, כולם סופרים לך את הבטן. מצד אחד "מאשאללה מורה", מצד שני "יאללה, מתי הבייבי". החברות שלי מהתיכון, חלקן כבר עם שניים, מסתכלות עליי כאילו אני מפגרת מאחור. לפעמים כשאני שומעת אותן אני כזה, מה אני עושה עם החיים שלי. אבל אז אני נזכרת בכרים. סאמי דווקא מאוד תומך, הוא הבן אדם שהכי מחזיק אותי, אבל אני לא תמיד מספרת לו כמה קשה כי אני לא רוצה להעמיס.</w:t>
       </w:r>
     </w:p>
     <w:p>
@@ -2665,7 +2682,7 @@
           <w:szCs w:val="24"/>
           <w:rtl w:val="1"/>
         </w:rPr>
-        <w:t xml:space="preserve">מיכל: </w:t>
+        <w:t xml:space="preserve">רים: </w:t>
       </w:r>
       <w:r>
         <w:rPr>
@@ -2721,7 +2738,7 @@
           <w:szCs w:val="24"/>
           <w:rtl w:val="1"/>
         </w:rPr>
-        <w:t xml:space="preserve">מיכל: </w:t>
+        <w:t xml:space="preserve">רים: </w:t>
       </w:r>
       <w:r>
         <w:rPr>
@@ -2777,7 +2794,7 @@
           <w:szCs w:val="24"/>
           <w:rtl w:val="1"/>
         </w:rPr>
-        <w:t xml:space="preserve">מיכל: </w:t>
+        <w:t xml:space="preserve">רים: </w:t>
       </w:r>
       <w:r>
         <w:rPr>
@@ -2833,7 +2850,7 @@
           <w:szCs w:val="24"/>
           <w:rtl w:val="1"/>
         </w:rPr>
-        <w:t xml:space="preserve">מיכל: </w:t>
+        <w:t xml:space="preserve">רים: </w:t>
       </w:r>
       <w:r>
         <w:rPr>
@@ -2843,7 +2860,7 @@
           <w:szCs w:val="24"/>
           <w:rtl w:val="1"/>
         </w:rPr>
-        <w:t>(מחייכת) היה יום שעומר קרא מילה שלמה בקול, מול כל הכיתה, בפעם הראשונה. והכיתה מחאה לו כפיים, כי כולם ידעו כמה זה קשה לו. והוא הסתכל עליי, חיפש אותי בעיניים, כאילו לבדוק שראיתי. וראיתי. (שתיקה) שם הרגשתי, אוקיי, זאת אני. זה מה שאני עושה בעולם. שבוע שלם הרגשתי שאני מרחפת.</w:t>
+        <w:t>(מחייכת) היה יום שכרים קרא מילה שלמה בקול, מול כל הכיתה, בפעם הראשונה. והכיתה מחאה לו כפיים, כי כולם ידעו כמה זה קשה לו. והוא הסתכל עליי, חיפש אותי בעיניים, כאילו לבדוק שראיתי. וראיתי. (שתיקה) שם הרגשתי, אוקיי, זאת אני. זה מה שאני עושה בעולם. שבוע שלם הרגשתי שאני מרחפת.</w:t>
       </w:r>
     </w:p>
     <w:p>
@@ -2889,7 +2906,7 @@
           <w:szCs w:val="24"/>
           <w:rtl w:val="1"/>
         </w:rPr>
-        <w:t xml:space="preserve">מיכל: </w:t>
+        <w:t xml:space="preserve">רים: </w:t>
       </w:r>
       <w:r>
         <w:rPr>
@@ -2899,7 +2916,7 @@
           <w:szCs w:val="24"/>
           <w:rtl w:val="1"/>
         </w:rPr>
-        <w:t>כן. אני מראה להם רגש. זה נגד כל מה שאמרו לי. אמרו לי תהיי קשוחה, אל תראי חולשה, ואני עושה בדיוק הפוך. אני אומרת להם כשאני עצובה, כשאני עייפה, כשמשהו שימח אותי. ואני חושבת שזה מה שעובד אצלי, דווקא זה. אולי זאת לא הדרך של רונית, אבל זאת הדרך שלי.</w:t>
+        <w:t>כן. אני מראה להם רגש. זה נגד כל מה שאמרו לי. אמרו לי תהיי קשוחה, אל תראי חולשה, ואני עושה בדיוק הפוך. אני אומרת להם כשאני עצובה, כשאני עייפה, כשמשהו שימח אותי. וגם, את יודעת, כולם חשבו שאני בחרתי בהוראה כי "זה מה שמתאים לבנות", כי זה נגמר מוקדם ואפשר להתחתן ולגדל ילדים. וזה מרגיז אותי. אני לא בחרתי בזה כי זה נוח. בחרתי בזה כי אני אוהבת את זה, כי זאת השליחות שלי. אז דווקא בזה אני עושה אחרת, אני מתייחסת לזה כמו למקצוע רציני, לא כמו לתחנת ביניים עד שאני "מתמסדת".</w:t>
       </w:r>
     </w:p>
     <w:p>
@@ -2945,7 +2962,7 @@
           <w:szCs w:val="24"/>
           <w:rtl w:val="1"/>
         </w:rPr>
-        <w:t xml:space="preserve">מיכל: </w:t>
+        <w:t xml:space="preserve">רים: </w:t>
       </w:r>
       <w:r>
         <w:rPr>
@@ -3001,7 +3018,7 @@
           <w:szCs w:val="24"/>
           <w:rtl w:val="1"/>
         </w:rPr>
-        <w:t xml:space="preserve">מיכל: </w:t>
+        <w:t xml:space="preserve">רים: </w:t>
       </w:r>
       <w:r>
         <w:rPr>
@@ -3011,7 +3028,7 @@
           <w:szCs w:val="24"/>
           <w:rtl w:val="1"/>
         </w:rPr>
-        <w:t>(שתיקה) את עומר. אני אזכור את עומר. ואני אזכור כמה הייתי לבד, אבל אני מקווה שאזכור את זה כמו שזוכרים משהו קשה שעברת ושרד. אני מקווה שבעוד עשר שנים אני אהיה המורה הוותיקה שרואה מורה צעירה יושבת לבד בחדר מורים, ואני אלך אליה ואשב לידה. את זה אני רוצה לזכור.</w:t>
+        <w:t>(שתיקה) את כרים. אני אזכור את כרים. ואני אזכור כמה הייתי לבד, אבל אני מקווה שאזכור את זה כמו שזוכרים משהו קשה שעברת ושרד. אני מקווה שבעוד עשר שנים אני אהיה המורה הוותיקה שרואה מורה צעירה יושבת לבד בחדר מורים, ואני אלך אליה ואשב לידה. את זה אני רוצה לזכור.</w:t>
       </w:r>
     </w:p>
     <w:p>
@@ -3057,7 +3074,7 @@
           <w:szCs w:val="24"/>
           <w:rtl w:val="1"/>
         </w:rPr>
-        <w:t xml:space="preserve">מיכל: </w:t>
+        <w:t xml:space="preserve">רים: </w:t>
       </w:r>
       <w:r>
         <w:rPr>
@@ -3113,7 +3130,7 @@
           <w:szCs w:val="24"/>
           <w:rtl w:val="1"/>
         </w:rPr>
-        <w:t xml:space="preserve">מיכל: </w:t>
+        <w:t xml:space="preserve">רים: </w:t>
       </w:r>
       <w:r>
         <w:rPr>
@@ -3123,7 +3140,7 @@
           <w:szCs w:val="24"/>
           <w:rtl w:val="1"/>
         </w:rPr>
-        <w:t>(חושבת) רק שאני שמחה שדיברנו. זה עשה לי משהו, לשמוע את עצמי אומרת את כל זה בקול. בדרך כלל אני רק רצה מיום ליום ואין לי זמן לעצור ולחשוב מה אני מרגישה. אז תודה על זה. (מחייכת) ובהצלחה לך, את יודעת שגם את הולכת לזה, נכון? (צוחקת)</w:t>
+        <w:t>(חושבת) רק שאני שמחה שדיברנו. זה עשה לי משהו, לשמוע את עצמי אומרת את כל זה בקול. בדרך כלל אני רק רצה מיום ליום ואין לי זמן לעצור ולחשוב מה אני מרגישה. אז תודה על זה. (מחייכת) ובהצלחה לך, את יודעת שגם את הולכת לזה, נכון? (צוחקת) אלחמדוללה שנדע רק טוב.</w:t>
       </w:r>
     </w:p>
     <w:p>
@@ -3151,7 +3168,7 @@
           <w:szCs w:val="24"/>
           <w:rtl w:val="1"/>
         </w:rPr>
-        <w:t>(צוחקת) אני יודעת. תודה רבה לך, מיכל.</w:t>
+        <w:t>(צוחקת) אני יודעת. תודה רבה לך, רים.</w:t>
       </w:r>
     </w:p>
     <w:sectPr>

</xml_diff>

<commit_message>
Complete every requirement: deepen body to 6-8 pages, add sources and page numbers
Address all assignment requirements in full: expanded the analysis (marking
theme occurrences in the text as step 8 requires), added the interviewee's
response to the "protest" reading and a methodological self-reflection,
brought the body to the required 6-8 page range. Added a references list
(Gilligan's listening-guide works, induction research, course materials)
with correct RTL/LTR handling, and page numbers in the footer.

Co-Authored-By: Claude Opus 4.8 <noreply@anthropic.com>
Claude-Session: https://claude.ai/code/session_01RbgP5xo8dmoCfJMjFozdfN
</commit_message>
<xml_diff>
--- a/עבודה מסכמת - מחקר מתקדם בחינוך - גראם.docx
+++ b/עבודה מסכמת - מחקר מתקדם בחינוך - גראם.docx
@@ -301,6 +301,23 @@
           <w:szCs w:val="25"/>
           <w:rtl w:val="1"/>
         </w:rPr>
+        <w:t>רשימת מקורות</w:t>
+      </w:r>
+    </w:p>
+    <w:p>
+      <w:pPr>
+        <w:bidi/>
+        <w:spacing w:after="120" w:before="0" w:line="360" w:lineRule="auto"/>
+        <w:jc w:val="right"/>
+      </w:pPr>
+      <w:r>
+        <w:rPr>
+          <w:rFonts w:ascii="David" w:hAnsi="David" w:cs="David"/>
+          <w:b w:val="0"/>
+          <w:sz w:val="25"/>
+          <w:szCs w:val="25"/>
+          <w:rtl w:val="1"/>
+        </w:rPr>
         <w:t>נספח: תמליל הראיון המלא</w:t>
       </w:r>
     </w:p>
@@ -997,7 +1014,7 @@
           <w:szCs w:val="24"/>
           <w:rtl w:val="1"/>
         </w:rPr>
-        <w:t>ניתחתי את הראיון על פי מדריך ההקשבה של קרול גיליגן, כפי שלמדנו ביחידות שבע ושמונה ובמצגת של השיעור השלישי, שלב אחר שלב.</w:t>
+        <w:t>ניתחתי את הראיון על פי מדריך ההקשבה של קרול גיליגן, כפי שלמדנו ביחידות שבע ושמונה ובמצגת של השיעור השלישי, שלב אחר שלב. המדריך הזה, שגיליגן ועמיתיה פיתחו כשיטת ניתוח יחסית וממוקדת קול (Gilligan, 1982; Gilligan et al., 2003), מבקש להקשיב לכמה קולות בו זמנית ולא ליישר את הסיפור לכדי נרטיב אחד חלק. ניסיתי לשמור על העיקרון הזה לכל אורך הדרך.</w:t>
       </w:r>
     </w:p>
     <w:p>
@@ -1285,7 +1302,7 @@
           <w:szCs w:val="24"/>
           <w:rtl w:val="1"/>
         </w:rPr>
-        <w:t>זיהיתי בטקסט כמה תמות שחוזרות שוב ושוב. הבולטת היא הבדידות, "אין למי", תחושת היחיד מול המערכת. תמה שנייה היא הפער בין הפנטזיה למציאות, בין מה שדמיינה למה שפגשה. תמה שלישית היא הכמיהה להכרה, הרצון שמישהו יראה כמה קשה היא עובדת. תמה רביעית היא העייפות והשחיקה הגופנית ממש, "אני מגיעה הביתה ריקה". תמה חמישית היא המשמעות, אותם רגעים עם התלמידים שבגללם היא נשארת. ותמה שישית, התכתיבים החברתיים והמגדריים בחברה הערבית, סביב "מורה טובה" וסביב "בת טובה", שמלווים אותה כל הזמן ברקע.</w:t>
+        <w:t>זיהיתי בטקסט כמה תמות שחוזרות שוב ושוב, וסימנתי לעצמי בטקסט את המופעים של כל אחת. הבולטת היא הבדידות. הביטוי "אין למי" חוזר לפחות ארבע פעמים לאורך הראיון, וגם "אני יושבת בפינה עם הקפה שלי וזהו" ו"לגמרי לבד בתוך אולם מלא אנשים" שייכים לה. תמה שנייה היא הפער בין הפנטזיה למציאות, שמופיעה כבר בהתחלה, "דמיינתי משהו אחר לגמרי", ומגיעה לשיא ב"הדמיון והמציאות זה שני דברים". תמה שלישית היא הכמיהה להכרה, הרצון שמישהו יראה כמה קשה היא עובדת, שבולט כשהיא מספרת על המנהל ש"לא שאל מה שלומי". תמה רביעית היא העייפות והשחיקה הגופנית ממש, "אני מגיעה הביתה ריקה", "עייפה עד העצמות". תמה חמישית היא המשמעות, אותם רגעים עם התלמידים שבגללם היא נשארת, ובראשם הסצנה שבה כרים קורא מילה שלמה. ותמה שישית, התכתיבים החברתיים והמגדריים בחברה הערבית, סביב "מורה טובה" וסביב "בת טובה", שחוזרים ב"מה שמתאים לבת", ב"מתי הבייבי" וב"תהיי קשוחה".</w:t>
       </w:r>
     </w:p>
     <w:p>
@@ -1321,7 +1338,7 @@
           <w:szCs w:val="24"/>
           <w:rtl w:val="1"/>
         </w:rPr>
-        <w:t>מה ששמעתי חיזק חלק ממה שידעתי מראש וגם ערער חלק. הוא חיזק את מה שלמדתי על שחיקה של מורים מתחילים ועל הקשיים המיוחדים של מערכת החינוך הערבית, המשאבים החסרים והכיתות הצפופות. אבל הוא גם ערער הנחה שלי. באתי עם ההנחה שמורה מתחילה שסובלת כל כך רוצה בעיקר לעזוב, ורים לימדה אותי שאפשר לסבול ולרצות להישאר בו זמנית, ושהמשמעות והכאב לא סותרים אלא חיים יחד. וגם ההנחה שלי שהיא נדחפה להוראה בגלל החברה התבררה כשטחית, כי רים דווקא בחרה בזה מתוך רצון עמוק, וזה לא הסתדר עם התמונה הפשטנית שהבאתי איתי.</w:t>
+        <w:t>מה ששמעתי חיזק חלק ממה שידעתי מראש וגם ערער חלק. הוא חיזק את מה שלמדתי על שחיקה של מורים מתחילים ועל החשיבות של ליווי אמיתי בשנים הראשונות, שהמחקר מראה שהוא מה שמבדיל בין מורה שנשארת למורה שעוזבת (Ingersoll &amp; Strong, 2011), ועל הקשיים המיוחדים של מערכת החינוך הערבית, המשאבים החסרים והכיתות הצפופות. הוא גם התכתב עם מה שגיליגן קוראת לו הקול של האכפתיות, אותה נטייה של רים לדבר על עצמה דרך הקשר שלה לאחרים ולא דרך הישגים. אבל הוא גם ערער הנחה שלי. באתי עם ההנחה שמורה מתחילה שסובלת כל כך רוצה בעיקר לעזוב, ורים לימדה אותי שאפשר לסבול ולרצות להישאר בו זמנית, ושהמשמעות והכאב לא סותרים אלא חיים יחד. וגם ההנחה שלי שהיא נדחפה להוראה בגלל החברה התבררה כשטחית, כי רים דווקא בחרה בזה מתוך רצון עמוק, וזה לא הסתדר עם התמונה הפשטנית שהבאתי איתי.</w:t>
       </w:r>
     </w:p>
     <w:p>
@@ -1480,7 +1497,24 @@
           <w:szCs w:val="24"/>
           <w:rtl w:val="1"/>
         </w:rPr>
-        <w:t>לגבי קטע הבכי בשירותים, היא ביקשה שאשאיר אותו. "בהתחלה התביישתי שסיפרתי לך את זה", היא אמרה, "בכפר לא מספרים דברים כאלה, מה יגידו. אבל כשקראתי הבנתי שזה בעצם הרגע הכי אמיתי בכל השיחה". היא סיימה ואמרה שהקריאה עשתה לה טוב, שזה כמו להסתכל על עצמך מבחוץ, ושהיא שמחה שהסכימה. יצאתי מהמפגש עם תחושה שהתהליך היה שלה לא פחות משהיה שלי.</w:t>
+        <w:t>היא גם הגיבה לחלק על המחאה, על ה"תהיי קשוחה". "כתבת שאני מתנגדת, ובאמת אני מתנגדת", היא אמרה, "אבל אני רוצה שתביני שזה לא קל להתנגד. כל יום אני שומעת קול בראש שאומר לי אולי סועאד צודקת, אולי אני נאיבית. אני בוחרת בדרך שלי אבל אני לא בטוחה בה כל בוקר מחדש". זה היה חשוב לי, כי הבנתי שהניתוח שלי הציג את ההתנגדות שלה כחד משמעית מדי, וגם בזה יש אמביוולנטיות שלא שמעתי מספיק כשכתבתי.</w:t>
+      </w:r>
+    </w:p>
+    <w:p>
+      <w:pPr>
+        <w:bidi/>
+        <w:spacing w:after="160" w:before="0" w:line="360" w:lineRule="auto"/>
+        <w:jc w:val="both"/>
+      </w:pPr>
+      <w:r>
+        <w:rPr>
+          <w:rFonts w:ascii="David" w:hAnsi="David" w:cs="David"/>
+          <w:b w:val="0"/>
+          <w:sz w:val="24"/>
+          <w:szCs w:val="24"/>
+          <w:rtl w:val="1"/>
+        </w:rPr>
+        <w:t>לגבי קטע הבכי בשירותים, היא ביקשה שאשאיר אותו. "בהתחלה התביישתי שסיפרתי לך את זה", היא אמרה, "בכפר לא מספרים דברים כאלה, מה יגידו. אבל כשקראתי הבנתי שזה בעצם הרגע הכי אמיתי בכל השיחה". היא סיימה ואמרה שהקריאה עשתה לה טוב, שזה כמו להסתכל על עצמך מבחוץ, ושהיא שמחה שהסכימה. יצאתי מהמפגש עם תחושה שהתהליך היה שלה לא פחות משהיה שלי, ושהשלב הזה, ההחזרה של הדברים למרואיינת, הוא לא פורמליות אלא באמת חלק מהמחקר.</w:t>
       </w:r>
     </w:p>
     <w:p>
@@ -1584,7 +1618,129 @@
           <w:szCs w:val="24"/>
           <w:rtl w:val="1"/>
         </w:rPr>
+        <w:t>גם על עצמי כחוקרת למדתי משהו. הבנתי כמה השאלות שלי הובילו את רים למקומות של כאב, ופחות למקומות של כוח. שאלתי "מה הכי קשה", "היו רגעים שרצית לוותר", והרבה פחות שאלתי על הרגעים הטובים, על מה עובד, על ההצלחות הקטנות. יכול להיות שבלי לשים לב חיפשתי אישור לסיפור העצוב שהיה לי בראש. אם הייתי מראיינת אותה שוב, הייתי מנסה לאזן, לתת מקום גם לחוזק ולא רק לשבר, כי גם הוא חלק מהאמת שלה. זה משהו שאקח איתי לראיונות הבאים.</w:t>
+      </w:r>
+    </w:p>
+    <w:p>
+      <w:pPr>
+        <w:bidi/>
+        <w:spacing w:after="160" w:before="0" w:line="360" w:lineRule="auto"/>
+        <w:jc w:val="both"/>
+      </w:pPr>
+      <w:r>
+        <w:rPr>
+          <w:rFonts w:ascii="David" w:hAnsi="David" w:cs="David"/>
+          <w:b w:val="0"/>
+          <w:sz w:val="24"/>
+          <w:szCs w:val="24"/>
+          <w:rtl w:val="1"/>
+        </w:rPr>
         <w:t>לגבי הנושא עצמו, אני יוצאת פחות בטוחה בהנחות שהבאתי. באתי עם סיפור מוכן בראש, על מערכת שזורקת מורות למים ועל חברה שמכתיבה להן את הדרך, ורים סיבכה לי אותו. היא באמת סובלת, וגם באמת אוהבת. היא כועסת על המערכת, וגם מרגישה שם בבית. אני לא יכולה יותר לספר את הסיפור הפשוט שרציתי לספר, וזה טוב. אני חושבת שנכנסתי לזה כדי לאשר משהו שכבר ידעתי, ויצאתי עם יותר שאלות מתשובות. אולי זה בדיוק העניין.</w:t>
+      </w:r>
+    </w:p>
+    <w:p>
+      <w:pPr>
+        <w:bidi/>
+      </w:pPr>
+      <w:r>
+        <w:br w:type="page"/>
+      </w:r>
+    </w:p>
+    <w:p>
+      <w:pPr>
+        <w:bidi/>
+        <w:spacing w:after="200" w:before="200" w:line="360" w:lineRule="auto"/>
+        <w:jc w:val="right"/>
+      </w:pPr>
+      <w:r>
+        <w:rPr>
+          <w:rFonts w:ascii="David" w:hAnsi="David" w:cs="David"/>
+          <w:b/>
+          <w:bCs/>
+          <w:color w:val="000000"/>
+          <w:sz w:val="34"/>
+          <w:szCs w:val="34"/>
+          <w:rtl w:val="1"/>
+        </w:rPr>
+        <w:t>רשימת מקורות</w:t>
+      </w:r>
+    </w:p>
+    <w:p>
+      <w:pPr>
+        <w:bidi/>
+        <w:spacing w:after="160" w:line="360" w:lineRule="auto"/>
+        <w:ind w:left="425" w:hanging="425"/>
+        <w:jc w:val="both"/>
+      </w:pPr>
+      <w:r>
+        <w:rPr>
+          <w:rFonts w:ascii="David" w:hAnsi="David" w:cs="David"/>
+          <w:b w:val="0"/>
+          <w:sz w:val="24"/>
+          <w:szCs w:val="24"/>
+          <w:rtl w:val="1"/>
+        </w:rPr>
+        <w:t>מדריך ההקשבה של קרול גיליגן, מתוך חומרי הקורס "מחקר מתקדם בחינוך", יחידות שבע ושמונה ומצגות השיעורים הראשון עד השלישי.</w:t>
+      </w:r>
+    </w:p>
+    <w:p>
+      <w:pPr>
+        <w:spacing w:after="160" w:line="360" w:lineRule="auto"/>
+        <w:ind w:left="709" w:hanging="709"/>
+        <w:jc w:val="left"/>
+      </w:pPr>
+      <w:r>
+        <w:rPr>
+          <w:rFonts w:ascii="Times New Roman" w:hAnsi="Times New Roman"/>
+          <w:color w:val="000000"/>
+          <w:sz w:val="24"/>
+        </w:rPr>
+        <w:t>Brown, L. M., &amp; Gilligan, C. (1992). Meeting at the Crossroads: Women's Psychology and Girls' Development. Cambridge, MA: Harvard University Press.</w:t>
+      </w:r>
+    </w:p>
+    <w:p>
+      <w:pPr>
+        <w:spacing w:after="160" w:line="360" w:lineRule="auto"/>
+        <w:ind w:left="709" w:hanging="709"/>
+        <w:jc w:val="left"/>
+      </w:pPr>
+      <w:r>
+        <w:rPr>
+          <w:rFonts w:ascii="Times New Roman" w:hAnsi="Times New Roman"/>
+          <w:color w:val="000000"/>
+          <w:sz w:val="24"/>
+        </w:rPr>
+        <w:t>Gilligan, C. (1982). In a Different Voice: Psychological Theory and Women's Development. Cambridge, MA: Harvard University Press.</w:t>
+      </w:r>
+    </w:p>
+    <w:p>
+      <w:pPr>
+        <w:spacing w:after="160" w:line="360" w:lineRule="auto"/>
+        <w:ind w:left="709" w:hanging="709"/>
+        <w:jc w:val="left"/>
+      </w:pPr>
+      <w:r>
+        <w:rPr>
+          <w:rFonts w:ascii="Times New Roman" w:hAnsi="Times New Roman"/>
+          <w:color w:val="000000"/>
+          <w:sz w:val="24"/>
+        </w:rPr>
+        <w:t>Gilligan, C., Spencer, R., Weinberg, M. K., &amp; Bertsch, T. (2003). On the Listening Guide: A voice-centered relational method. In P. M. Camic, J. E. Rhodes, &amp; L. Yardley (Eds.), Qualitative Research in Psychology: Expanding Perspectives in Methodology and Design (pp. 157-172). Washington, DC: American Psychological Association.</w:t>
+      </w:r>
+    </w:p>
+    <w:p>
+      <w:pPr>
+        <w:spacing w:after="160" w:line="360" w:lineRule="auto"/>
+        <w:ind w:left="709" w:hanging="709"/>
+        <w:jc w:val="left"/>
+      </w:pPr>
+      <w:r>
+        <w:rPr>
+          <w:rFonts w:ascii="Times New Roman" w:hAnsi="Times New Roman"/>
+          <w:color w:val="000000"/>
+          <w:sz w:val="24"/>
+        </w:rPr>
+        <w:t>Ingersoll, R. M., &amp; Strong, M. (2011). The impact of induction and mentoring programs for beginning teachers: A critical review of the research. Review of Educational Research, 81(2), 201-233.</w:t>
       </w:r>
     </w:p>
     <w:p>
@@ -3172,6 +3328,7 @@
       </w:r>
     </w:p>
     <w:sectPr>
+      <w:footerReference w:type="default" r:id="rId9"/>
       <w:pgSz w:w="12240" w:h="15840"/>
       <w:pgMar w:top="1417" w:right="1417" w:bottom="1417" w:left="1417" w:header="720" w:footer="720" w:gutter="0"/>
       <w:cols w:space="720"/>
@@ -3180,6 +3337,26 @@
     </w:sectPr>
   </w:body>
 </w:document>
+</file>
+
+<file path=word/footer1.xml><?xml version="1.0" encoding="utf-8"?>
+<w:ftr xmlns:m="http://schemas.openxmlformats.org/officeDocument/2006/math" xmlns:mc="http://schemas.openxmlformats.org/markup-compatibility/2006" xmlns:mo="http://schemas.microsoft.com/office/mac/office/2008/main" xmlns:mv="urn:schemas-microsoft-com:mac:vml" xmlns:o="urn:schemas-microsoft-com:office:office" xmlns:r="http://schemas.openxmlformats.org/officeDocument/2006/relationships" xmlns:v="urn:schemas-microsoft-com:vml" xmlns:w10="urn:schemas-microsoft-com:office:word" xmlns:w14="http://schemas.microsoft.com/office/word/2010/wordml" xmlns:w="http://schemas.openxmlformats.org/wordprocessingml/2006/main" xmlns:wne="http://schemas.microsoft.com/office/word/2006/wordml" xmlns:wp14="http://schemas.microsoft.com/office/word/2010/wordprocessingDrawing" xmlns:wp="http://schemas.openxmlformats.org/drawingml/2006/wordprocessingDrawing" xmlns:wpc="http://schemas.microsoft.com/office/word/2010/wordprocessingCanvas" xmlns:wpg="http://schemas.microsoft.com/office/word/2010/wordprocessingGroup" xmlns:wpi="http://schemas.microsoft.com/office/word/2010/wordprocessingInk" xmlns:wps="http://schemas.microsoft.com/office/word/2010/wordprocessingShape" mc:Ignorable="w14 wp14">
+  <w:p>
+    <w:pPr>
+      <w:pStyle w:val="Footer"/>
+      <w:jc w:val="center"/>
+    </w:pPr>
+    <w:r>
+      <w:rPr>
+        <w:rFonts w:ascii="David" w:hAnsi="David"/>
+        <w:sz w:val="22"/>
+      </w:rPr>
+      <w:fldChar w:fldCharType="begin"/>
+      <w:instrText xml:space="preserve"> PAGE </w:instrText>
+      <w:fldChar w:fldCharType="end"/>
+    </w:r>
+  </w:p>
+</w:ftr>
 </file>
 
 <file path=word/numbering.xml><?xml version="1.0" encoding="utf-8"?>

</xml_diff>

<commit_message>
Present the Gilligan analysis as a table (stage / explanation / my interview)
Reformat section 4 into the three-column listening-guide table used in the
course materials: stage, explanation of the stage, and the analysis applied
to my interview (Reem) in the third column, replacing the course's Gershon
example. Table runs right-to-left (bidiVisual), all 11 listening steps,
black borders and text.

Co-Authored-By: Claude Opus 4.8 <noreply@anthropic.com>
Claude-Session: https://claude.ai/code/session_01RbgP5xo8dmoCfJMjFozdfN
</commit_message>
<xml_diff>
--- a/עבודה מסכמת - מחקר מתקדם בחינוך - גראם.docx
+++ b/עבודה מסכמת - מחקר מתקדם בחינוך - גראם.docx
@@ -1017,29 +1017,892 @@
         <w:t>ניתחתי את הראיון על פי מדריך ההקשבה של קרול גיליגן, כפי שלמדנו ביחידות שבע ושמונה ובמצגת של השיעור השלישי, שלב אחר שלב. המדריך הזה, שגיליגן ועמיתיה פיתחו כשיטת ניתוח יחסית וממוקדת קול (Gilligan, 1982; Gilligan et al., 2003), מבקש להקשיב לכמה קולות בו זמנית ולא ליישר את הסיפור לכדי נרטיב אחד חלק. ניסיתי לשמור על העיקרון הזה לכל אורך הדרך.</w:t>
       </w:r>
     </w:p>
+    <w:tbl>
+      <w:tblPr>
+        <w:tblStyle w:val="TableGrid"/>
+        <w:tblW w:type="auto" w:w="0"/>
+        <w:jc w:val="center"/>
+        <w:tblLayout w:type="fixed"/>
+        <w:tblLook w:firstColumn="1" w:firstRow="1" w:lastColumn="0" w:lastRow="0" w:noHBand="0" w:noVBand="1" w:val="04A0"/>
+        <w:bidiVisual/>
+        <w:tblLayout w:type="fixed"/>
+      </w:tblPr>
+      <w:tblGrid>
+        <w:gridCol w:w="3135"/>
+        <w:gridCol w:w="3135"/>
+        <w:gridCol w:w="3135"/>
+      </w:tblGrid>
+      <w:tr>
+        <w:tc>
+          <w:tcPr>
+            <w:tcW w:type="dxa" w:w="2097"/>
+          </w:tcPr>
+          <w:p>
+            <w:pPr>
+              <w:bidi/>
+              <w:spacing w:after="40" w:before="40" w:line="276" w:lineRule="auto"/>
+              <w:jc w:val="center"/>
+            </w:pPr>
+            <w:r/>
+            <w:r>
+              <w:rPr>
+                <w:rFonts w:ascii="David" w:hAnsi="David" w:cs="David"/>
+                <w:b/>
+                <w:bCs/>
+                <w:sz w:val="22"/>
+                <w:szCs w:val="22"/>
+                <w:rtl w:val="1"/>
+              </w:rPr>
+              <w:t>שלב הניתוח</w:t>
+            </w:r>
+          </w:p>
+        </w:tc>
+        <w:tc>
+          <w:tcPr>
+            <w:tcW w:type="dxa" w:w="2608"/>
+          </w:tcPr>
+          <w:p>
+            <w:pPr>
+              <w:bidi/>
+              <w:spacing w:after="40" w:before="40" w:line="276" w:lineRule="auto"/>
+              <w:jc w:val="center"/>
+            </w:pPr>
+            <w:r/>
+            <w:r>
+              <w:rPr>
+                <w:rFonts w:ascii="David" w:hAnsi="David" w:cs="David"/>
+                <w:b/>
+                <w:bCs/>
+                <w:sz w:val="22"/>
+                <w:szCs w:val="22"/>
+                <w:rtl w:val="1"/>
+              </w:rPr>
+              <w:t>הסבר השלב</w:t>
+            </w:r>
+          </w:p>
+        </w:tc>
+        <w:tc>
+          <w:tcPr>
+            <w:tcW w:type="dxa" w:w="4365"/>
+          </w:tcPr>
+          <w:p>
+            <w:pPr>
+              <w:bidi/>
+              <w:spacing w:after="40" w:before="40" w:line="276" w:lineRule="auto"/>
+              <w:jc w:val="center"/>
+            </w:pPr>
+            <w:r/>
+            <w:r>
+              <w:rPr>
+                <w:rFonts w:ascii="David" w:hAnsi="David" w:cs="David"/>
+                <w:b/>
+                <w:bCs/>
+                <w:sz w:val="22"/>
+                <w:szCs w:val="22"/>
+                <w:rtl w:val="1"/>
+              </w:rPr>
+              <w:t>הניתוח בראיון שלי (רים)</w:t>
+            </w:r>
+          </w:p>
+        </w:tc>
+      </w:tr>
+      <w:tr>
+        <w:tc>
+          <w:tcPr>
+            <w:tcW w:type="dxa" w:w="2097"/>
+          </w:tcPr>
+          <w:p>
+            <w:pPr>
+              <w:bidi/>
+              <w:spacing w:after="40" w:before="40" w:line="276" w:lineRule="auto"/>
+              <w:jc w:val="right"/>
+            </w:pPr>
+            <w:r/>
+            <w:r>
+              <w:rPr>
+                <w:rFonts w:ascii="David" w:hAnsi="David" w:cs="David"/>
+                <w:b/>
+                <w:bCs/>
+                <w:sz w:val="21"/>
+                <w:szCs w:val="21"/>
+                <w:rtl w:val="1"/>
+              </w:rPr>
+              <w:t>1. הקריאה הראשונה: בקריאה הראשונה שימו לב לסיפור שמספרת המרואיינת. תארי את עיקרי הסיפור: מי מדברת? מה הדברים העיקריים שהיא מספרת?</w:t>
+            </w:r>
+          </w:p>
+        </w:tc>
+        <w:tc>
+          <w:tcPr>
+            <w:tcW w:type="dxa" w:w="2608"/>
+          </w:tcPr>
+          <w:p>
+            <w:pPr>
+              <w:bidi/>
+              <w:spacing w:after="40" w:before="40" w:line="276" w:lineRule="auto"/>
+              <w:jc w:val="right"/>
+            </w:pPr>
+            <w:r/>
+            <w:r>
+              <w:rPr>
+                <w:rFonts w:ascii="David" w:hAnsi="David" w:cs="David"/>
+                <w:b w:val="0"/>
+                <w:sz w:val="21"/>
+                <w:szCs w:val="21"/>
+                <w:rtl w:val="1"/>
+              </w:rPr>
+              <w:t>בכל ראיון יש סיפור כלשהו, שאדם מספר על חוויותיו או על חוויות של אחר. תארו את הסיפור כפי שהוא מסופר על ידי המרואיינת, פשוטו כמשמעו.</w:t>
+            </w:r>
+          </w:p>
+        </w:tc>
+        <w:tc>
+          <w:tcPr>
+            <w:tcW w:type="dxa" w:w="4365"/>
+          </w:tcPr>
+          <w:p>
+            <w:pPr>
+              <w:bidi/>
+              <w:spacing w:after="40" w:before="40" w:line="276" w:lineRule="auto"/>
+              <w:jc w:val="right"/>
+            </w:pPr>
+            <w:r/>
+            <w:r>
+              <w:rPr>
+                <w:rFonts w:ascii="David" w:hAnsi="David" w:cs="David"/>
+                <w:b w:val="0"/>
+                <w:sz w:val="21"/>
+                <w:szCs w:val="21"/>
+                <w:rtl w:val="1"/>
+              </w:rPr>
+              <w:t>רים, מורה מתחילה בת עשרים ושבע, מלמדת כיתה ג' בבית ספר יסודי בכפר בגליל, בשנתה הראשונה. היא מספרת על הפער בין ההתלהבות שאיתה נכנסה לבין העייפות והבדידות שפגשה בשטח. זה סיפור על מישהי שרצתה מאוד, שנפלה, ושמצאה בדרך גם רגעים של משמעות שהחזיקו אותה. במרכזו מתח מתמשך בין הרצון לתת לבין התחושה שאין לה על מי להישען.</w:t>
+            </w:r>
+          </w:p>
+        </w:tc>
+      </w:tr>
+      <w:tr>
+        <w:tc>
+          <w:tcPr>
+            <w:tcW w:type="dxa" w:w="2097"/>
+          </w:tcPr>
+          <w:p>
+            <w:pPr>
+              <w:bidi/>
+              <w:spacing w:after="40" w:before="40" w:line="276" w:lineRule="auto"/>
+              <w:jc w:val="right"/>
+            </w:pPr>
+            <w:r/>
+            <w:r>
+              <w:rPr>
+                <w:rFonts w:ascii="David" w:hAnsi="David" w:cs="David"/>
+                <w:b/>
+                <w:bCs/>
+                <w:sz w:val="21"/>
+                <w:szCs w:val="21"/>
+                <w:rtl w:val="1"/>
+              </w:rPr>
+              <w:t>2. באיזו תרבות המרואיינת ממקמת את עצמה?</w:t>
+            </w:r>
+          </w:p>
+        </w:tc>
+        <w:tc>
+          <w:tcPr>
+            <w:tcW w:type="dxa" w:w="2608"/>
+          </w:tcPr>
+          <w:p>
+            <w:pPr>
+              <w:bidi/>
+              <w:spacing w:after="40" w:before="40" w:line="276" w:lineRule="auto"/>
+              <w:jc w:val="right"/>
+            </w:pPr>
+            <w:r/>
+            <w:r>
+              <w:rPr>
+                <w:rFonts w:ascii="David" w:hAnsi="David" w:cs="David"/>
+                <w:b w:val="0"/>
+                <w:sz w:val="21"/>
+                <w:szCs w:val="21"/>
+                <w:rtl w:val="1"/>
+              </w:rPr>
+              <w:t>אדם אינו חווה חוויות במנותק מהמציאות. המקום שבו הוא נמצא והתרבות שאליה הוא משתייך אינם תוספת אלא חלק משמעותי ממנו. יש הבדל אם אני גרה במאה שערים או בסן פרנסיסקו.</w:t>
+            </w:r>
+          </w:p>
+        </w:tc>
+        <w:tc>
+          <w:tcPr>
+            <w:tcW w:type="dxa" w:w="4365"/>
+          </w:tcPr>
+          <w:p>
+            <w:pPr>
+              <w:bidi/>
+              <w:spacing w:after="40" w:before="40" w:line="276" w:lineRule="auto"/>
+              <w:jc w:val="right"/>
+            </w:pPr>
+            <w:r/>
+            <w:r>
+              <w:rPr>
+                <w:rFonts w:ascii="David" w:hAnsi="David" w:cs="David"/>
+                <w:b w:val="0"/>
+                <w:sz w:val="21"/>
+                <w:szCs w:val="21"/>
+                <w:rtl w:val="1"/>
+              </w:rPr>
+              <w:t>רים ממקמת את עצמה בתוך החברה הערבית בכפר בגליל ובתוך מערכת החינוך הערבית על מצוקותיה, כיתות צפופות ומחסור במשאבים. אצלה הוראה נתפסת גם כשליחות וגם כמקצוע שמתאים לבת. כשהיא אומרת אצלנו בכפר כולם מכירים את כולם, אין לאן לברוח, היא ממקמת את עצמה בקהילה קטנה שבה גם המצוקה שלה חשופה לעיני כולם.</w:t>
+            </w:r>
+          </w:p>
+        </w:tc>
+      </w:tr>
+      <w:tr>
+        <w:tc>
+          <w:tcPr>
+            <w:tcW w:type="dxa" w:w="2097"/>
+          </w:tcPr>
+          <w:p>
+            <w:pPr>
+              <w:bidi/>
+              <w:spacing w:after="40" w:before="40" w:line="276" w:lineRule="auto"/>
+              <w:jc w:val="right"/>
+            </w:pPr>
+            <w:r/>
+            <w:r>
+              <w:rPr>
+                <w:rFonts w:ascii="David" w:hAnsi="David" w:cs="David"/>
+                <w:b/>
+                <w:bCs/>
+                <w:sz w:val="21"/>
+                <w:szCs w:val="21"/>
+                <w:rtl w:val="1"/>
+              </w:rPr>
+              <w:t>3. האם בסיפור מופיעות מערכות יחסים? מיהם הגיבורים? מהן מערכות היחסים ביניהם?</w:t>
+            </w:r>
+          </w:p>
+        </w:tc>
+        <w:tc>
+          <w:tcPr>
+            <w:tcW w:type="dxa" w:w="2608"/>
+          </w:tcPr>
+          <w:p>
+            <w:pPr>
+              <w:bidi/>
+              <w:spacing w:after="40" w:before="40" w:line="276" w:lineRule="auto"/>
+              <w:jc w:val="right"/>
+            </w:pPr>
+            <w:r/>
+            <w:r>
+              <w:rPr>
+                <w:rFonts w:ascii="David" w:hAnsi="David" w:cs="David"/>
+                <w:b w:val="0"/>
+                <w:sz w:val="21"/>
+                <w:szCs w:val="21"/>
+                <w:rtl w:val="1"/>
+              </w:rPr>
+              <w:t>נרטיב של אדם מורכב מרשתות חברתיות ומערכות יחסים מגוונות, חלקן קרובות וחלקן רחוקות. רצוי לא להניח מראש את דרגות הקרבה, אלא להקשיב ולהבין את סוג הקשרים והשפעתם, ולשים לב גם לקשר שהמרואיינת לא הזכירה.</w:t>
+            </w:r>
+          </w:p>
+        </w:tc>
+        <w:tc>
+          <w:tcPr>
+            <w:tcW w:type="dxa" w:w="4365"/>
+          </w:tcPr>
+          <w:p>
+            <w:pPr>
+              <w:bidi/>
+              <w:spacing w:after="40" w:before="40" w:line="276" w:lineRule="auto"/>
+              <w:jc w:val="right"/>
+            </w:pPr>
+            <w:r/>
+            <w:r>
+              <w:rPr>
+                <w:rFonts w:ascii="David" w:hAnsi="David" w:cs="David"/>
+                <w:b w:val="0"/>
+                <w:sz w:val="21"/>
+                <w:szCs w:val="21"/>
+                <w:rtl w:val="1"/>
+              </w:rPr>
+              <w:t>עולות כמה מערכות יחסים: התלמידים, ובראשם כרים שאליו נקשרה עמוקות; סועאד החונכת, קשר אמביוולנטי של הערכה ואכזבה; הצוות הוותיק שממנו היא חשה מרוחקת; והמנהל, דמות גברית סמכותית ולא נגישה. בלט דווקא קשר שכמעט לא הוזכר, בעלה סאמי, ושאלתי את עצמי אם הזוגיות נדחקה בגלל העומס.</w:t>
+            </w:r>
+          </w:p>
+        </w:tc>
+      </w:tr>
+      <w:tr>
+        <w:tc>
+          <w:tcPr>
+            <w:tcW w:type="dxa" w:w="2097"/>
+          </w:tcPr>
+          <w:p>
+            <w:pPr>
+              <w:bidi/>
+              <w:spacing w:after="40" w:before="40" w:line="276" w:lineRule="auto"/>
+              <w:jc w:val="right"/>
+            </w:pPr>
+            <w:r/>
+            <w:r>
+              <w:rPr>
+                <w:rFonts w:ascii="David" w:hAnsi="David" w:cs="David"/>
+                <w:b/>
+                <w:bCs/>
+                <w:sz w:val="21"/>
+                <w:szCs w:val="21"/>
+                <w:rtl w:val="1"/>
+              </w:rPr>
+              <w:t>4. אילו רגשות התעוררו בי (המראיינת) במהלך הראיון? האם הזדהיתי? האם התעוררה בי אמפתיה? היו מקומות של כעס או חוסר סבלנות?</w:t>
+            </w:r>
+          </w:p>
+        </w:tc>
+        <w:tc>
+          <w:tcPr>
+            <w:tcW w:type="dxa" w:w="2608"/>
+          </w:tcPr>
+          <w:p>
+            <w:pPr>
+              <w:bidi/>
+              <w:spacing w:after="40" w:before="40" w:line="276" w:lineRule="auto"/>
+              <w:jc w:val="right"/>
+            </w:pPr>
+            <w:r/>
+            <w:r>
+              <w:rPr>
+                <w:rFonts w:ascii="David" w:hAnsi="David" w:cs="David"/>
+                <w:b w:val="0"/>
+                <w:sz w:val="21"/>
+                <w:szCs w:val="21"/>
+                <w:rtl w:val="1"/>
+              </w:rPr>
+              <w:t>לכולנו יש רגשות ועמדות. כמראיינים עלינו להיות קשובים לרגשות שלנו, כי הם השפיעו על השאלות שבחרנו לשאול או שנמנענו מהן, ואם חשנו אמפתיה נכתוב את הסיפור אחרת.</w:t>
+            </w:r>
+          </w:p>
+        </w:tc>
+        <w:tc>
+          <w:tcPr>
+            <w:tcW w:type="dxa" w:w="4365"/>
+          </w:tcPr>
+          <w:p>
+            <w:pPr>
+              <w:bidi/>
+              <w:spacing w:after="40" w:before="40" w:line="276" w:lineRule="auto"/>
+              <w:jc w:val="right"/>
+            </w:pPr>
+            <w:r/>
+            <w:r>
+              <w:rPr>
+                <w:rFonts w:ascii="David" w:hAnsi="David" w:cs="David"/>
+                <w:b w:val="0"/>
+                <w:sz w:val="21"/>
+                <w:szCs w:val="21"/>
+                <w:rtl w:val="1"/>
+              </w:rPr>
+              <w:t>הרגשתי הזדהות חזקה, אולי חזקה מדי, כי אני עצמי עומדת להיכנס להוראה. הייתי צריכה להיזהר לא לשמוע רק את מה שמאשר את הפחדים שלי. היו רגעים של חוסר סבלנות קטן, כשאמרה לא מתחרטת מיד אחרי סיפור הבכי, וגם קצת אשמה. בעיקר חשתי כלפיה חום וכבוד.</w:t>
+            </w:r>
+          </w:p>
+        </w:tc>
+      </w:tr>
+      <w:tr>
+        <w:tc>
+          <w:tcPr>
+            <w:tcW w:type="dxa" w:w="2097"/>
+          </w:tcPr>
+          <w:p>
+            <w:pPr>
+              <w:bidi/>
+              <w:spacing w:after="40" w:before="40" w:line="276" w:lineRule="auto"/>
+              <w:jc w:val="right"/>
+            </w:pPr>
+            <w:r/>
+            <w:r>
+              <w:rPr>
+                <w:rFonts w:ascii="David" w:hAnsi="David" w:cs="David"/>
+                <w:b/>
+                <w:bCs/>
+                <w:sz w:val="21"/>
+                <w:szCs w:val="21"/>
+                <w:rtl w:val="1"/>
+              </w:rPr>
+              <w:t>5. שפת המרואיינת: באילו מטאפורות היא משתמשת? אילו מילים או ביטויים חוזרים בראיון?</w:t>
+            </w:r>
+          </w:p>
+        </w:tc>
+        <w:tc>
+          <w:tcPr>
+            <w:tcW w:type="dxa" w:w="2608"/>
+          </w:tcPr>
+          <w:p>
+            <w:pPr>
+              <w:bidi/>
+              <w:spacing w:after="40" w:before="40" w:line="276" w:lineRule="auto"/>
+              <w:jc w:val="right"/>
+            </w:pPr>
+            <w:r/>
+            <w:r>
+              <w:rPr>
+                <w:rFonts w:ascii="David" w:hAnsi="David" w:cs="David"/>
+                <w:b w:val="0"/>
+                <w:sz w:val="21"/>
+                <w:szCs w:val="21"/>
+                <w:rtl w:val="1"/>
+              </w:rPr>
+              <w:t>לכל אדם עולם אסוציאציות אישי ותרבותי, ודרכו אפשר להבין אותו. במיוחד דרך ביטויים חוזרים, למשל מי שאומר שוב ושוב ברוך השם, או מטאפורות כמו סוף העולם, שמלמדות על הפרספקטיבה שלו.</w:t>
+            </w:r>
+          </w:p>
+        </w:tc>
+        <w:tc>
+          <w:tcPr>
+            <w:tcW w:type="dxa" w:w="4365"/>
+          </w:tcPr>
+          <w:p>
+            <w:pPr>
+              <w:bidi/>
+              <w:spacing w:after="40" w:before="40" w:line="276" w:lineRule="auto"/>
+              <w:jc w:val="right"/>
+            </w:pPr>
+            <w:r/>
+            <w:r>
+              <w:rPr>
+                <w:rFonts w:ascii="David" w:hAnsi="David" w:cs="David"/>
+                <w:b w:val="0"/>
+                <w:sz w:val="21"/>
+                <w:szCs w:val="21"/>
+                <w:rtl w:val="1"/>
+              </w:rPr>
+              <w:t>שפה של מים וטביעה: זרקו אותי למים ומי שלא יודע לשחות טובע, אני מרגישה שאני טובעת. שפה של קרב: כל בוקר זה עוד מערכה. לצד זה מטאפורה חמה: הכיתה הפכה להיות הבית השני שלי. שני ביטויים חוזרים: אין למי, שמבטא בדידות, ואלחמדוללה, שאמרה גם ברגעים הקשים, כמעט כנשימה שמחזיקה אותה.</w:t>
+            </w:r>
+          </w:p>
+        </w:tc>
+      </w:tr>
+      <w:tr>
+        <w:tc>
+          <w:tcPr>
+            <w:tcW w:type="dxa" w:w="2097"/>
+          </w:tcPr>
+          <w:p>
+            <w:pPr>
+              <w:bidi/>
+              <w:spacing w:after="40" w:before="40" w:line="276" w:lineRule="auto"/>
+              <w:jc w:val="right"/>
+            </w:pPr>
+            <w:r/>
+            <w:r>
+              <w:rPr>
+                <w:rFonts w:ascii="David" w:hAnsi="David" w:cs="David"/>
+                <w:b/>
+                <w:bCs/>
+                <w:sz w:val="21"/>
+                <w:szCs w:val="21"/>
+                <w:rtl w:val="1"/>
+              </w:rPr>
+              <w:t>6. האם יש סתירות בדברי המרואיינת? האם אנחנו שומעים מקום של אמביוולנטיות?</w:t>
+            </w:r>
+          </w:p>
+        </w:tc>
+        <w:tc>
+          <w:tcPr>
+            <w:tcW w:type="dxa" w:w="2608"/>
+          </w:tcPr>
+          <w:p>
+            <w:pPr>
+              <w:bidi/>
+              <w:spacing w:after="40" w:before="40" w:line="276" w:lineRule="auto"/>
+              <w:jc w:val="right"/>
+            </w:pPr>
+            <w:r/>
+            <w:r>
+              <w:rPr>
+                <w:rFonts w:ascii="David" w:hAnsi="David" w:cs="David"/>
+                <w:b w:val="0"/>
+                <w:sz w:val="21"/>
+                <w:szCs w:val="21"/>
+                <w:rtl w:val="1"/>
+              </w:rPr>
+              <w:t>חוויית אדם אינה חלקה, וראיון טוב יכיל מגוון רגשות וסתירות. אל לנו למחוק אותן או לשטח את האדם לכדי סיפור הרמוני אחד. הסתירות מגיעות מהמקומות האמיתיים שלו, ועלינו לשמוע אותן כאילו בסטריאו.</w:t>
+            </w:r>
+          </w:p>
+        </w:tc>
+        <w:tc>
+          <w:tcPr>
+            <w:tcW w:type="dxa" w:w="4365"/>
+          </w:tcPr>
+          <w:p>
+            <w:pPr>
+              <w:bidi/>
+              <w:spacing w:after="40" w:before="40" w:line="276" w:lineRule="auto"/>
+              <w:jc w:val="right"/>
+            </w:pPr>
+            <w:r/>
+            <w:r>
+              <w:rPr>
+                <w:rFonts w:ascii="David" w:hAnsi="David" w:cs="David"/>
+                <w:b w:val="0"/>
+                <w:sz w:val="21"/>
+                <w:szCs w:val="21"/>
+                <w:rtl w:val="1"/>
+              </w:rPr>
+              <w:t>לא מתחרטת על שנייה מול הבכי בשירותים; אני שייכת מול אני זרה שם; על החונכת למדתי ממנה הכול מול כשהייתי צריכה אותה היא לא הייתה. לא יישרתי את הסתירות, הן שני סיפורים שנשמעים בסטריאו: רים גם אוהבת את המקום וגם רוצה לברוח ממנו, ושתי האמיתות חיות בה יחד.</w:t>
+            </w:r>
+          </w:p>
+        </w:tc>
+      </w:tr>
+      <w:tr>
+        <w:tc>
+          <w:tcPr>
+            <w:tcW w:type="dxa" w:w="2097"/>
+          </w:tcPr>
+          <w:p>
+            <w:pPr>
+              <w:bidi/>
+              <w:spacing w:after="40" w:before="40" w:line="276" w:lineRule="auto"/>
+              <w:jc w:val="right"/>
+            </w:pPr>
+            <w:r/>
+            <w:r>
+              <w:rPr>
+                <w:rFonts w:ascii="David" w:hAnsi="David" w:cs="David"/>
+                <w:b/>
+                <w:bCs/>
+                <w:sz w:val="21"/>
+                <w:szCs w:val="21"/>
+                <w:rtl w:val="1"/>
+              </w:rPr>
+              <w:t>7. האם ניתן להבחין במקומות שבהם המרואיינת מביעה מחאה או התנגדות כנגד מוסכמות חברתיות? אם כן, תארו ופרטו.</w:t>
+            </w:r>
+          </w:p>
+        </w:tc>
+        <w:tc>
+          <w:tcPr>
+            <w:tcW w:type="dxa" w:w="2608"/>
+          </w:tcPr>
+          <w:p>
+            <w:pPr>
+              <w:bidi/>
+              <w:spacing w:after="40" w:before="40" w:line="276" w:lineRule="auto"/>
+              <w:jc w:val="right"/>
+            </w:pPr>
+            <w:r/>
+            <w:r>
+              <w:rPr>
+                <w:rFonts w:ascii="David" w:hAnsi="David" w:cs="David"/>
+                <w:b w:val="0"/>
+                <w:sz w:val="21"/>
+                <w:szCs w:val="21"/>
+                <w:rtl w:val="1"/>
+              </w:rPr>
+              <w:t>מגיל אפס אנו גדלים בחברה עם תכתיבים, נימוסיים, התנהגותיים ומגדריים. יש זמנים בחיים שבהם אנו בוחנים את התכתיבים הללו ומסרבים לקבלם. זוהי דרך מרתקת להבין את נפש המרואיינת.</w:t>
+            </w:r>
+          </w:p>
+        </w:tc>
+        <w:tc>
+          <w:tcPr>
+            <w:tcW w:type="dxa" w:w="4365"/>
+          </w:tcPr>
+          <w:p>
+            <w:pPr>
+              <w:bidi/>
+              <w:spacing w:after="40" w:before="40" w:line="276" w:lineRule="auto"/>
+              <w:jc w:val="right"/>
+            </w:pPr>
+            <w:r/>
+            <w:r>
+              <w:rPr>
+                <w:rFonts w:ascii="David" w:hAnsi="David" w:cs="David"/>
+                <w:b w:val="0"/>
+                <w:sz w:val="21"/>
+                <w:szCs w:val="21"/>
+                <w:rtl w:val="1"/>
+              </w:rPr>
+              <w:t>שתי מחאות. האחת נגד תהיי קשוחה, אל תראי חולשה, ורים בחרה לבכות מול הכיתה ומצאה שדווקא זה קירב אותם. השנייה, עמוקה לא פחות, נגד ההנחה שבחרה בהוראה כי זה מה שמתאים לבת, והיא מתעקשת שזאת שליחות ולא ברירת מחדל. על שתיהן היא משלמת מחיר של ביקורת מהצוות ומהמשפחה.</w:t>
+            </w:r>
+          </w:p>
+        </w:tc>
+      </w:tr>
+      <w:tr>
+        <w:tc>
+          <w:tcPr>
+            <w:tcW w:type="dxa" w:w="2097"/>
+          </w:tcPr>
+          <w:p>
+            <w:pPr>
+              <w:bidi/>
+              <w:spacing w:after="40" w:before="40" w:line="276" w:lineRule="auto"/>
+              <w:jc w:val="right"/>
+            </w:pPr>
+            <w:r/>
+            <w:r>
+              <w:rPr>
+                <w:rFonts w:ascii="David" w:hAnsi="David" w:cs="David"/>
+                <w:b/>
+                <w:bCs/>
+                <w:sz w:val="21"/>
+                <w:szCs w:val="21"/>
+                <w:rtl w:val="1"/>
+              </w:rPr>
+              <w:t>8. ההאזנה השמינית: זהו בטקסט תמות חוזרות ונשנות. מהן? סמנו בטקסט את המופעים של כל תמה.</w:t>
+            </w:r>
+          </w:p>
+        </w:tc>
+        <w:tc>
+          <w:tcPr>
+            <w:tcW w:type="dxa" w:w="2608"/>
+          </w:tcPr>
+          <w:p>
+            <w:pPr>
+              <w:bidi/>
+              <w:spacing w:after="40" w:before="40" w:line="276" w:lineRule="auto"/>
+              <w:jc w:val="right"/>
+            </w:pPr>
+            <w:r/>
+            <w:r>
+              <w:rPr>
+                <w:rFonts w:ascii="David" w:hAnsi="David" w:cs="David"/>
+                <w:b w:val="0"/>
+                <w:sz w:val="21"/>
+                <w:szCs w:val="21"/>
+                <w:rtl w:val="1"/>
+              </w:rPr>
+              <w:t>כדי לספר את סיפור האדם עלינו לזהות תמות שחוזרות בטקסט. תמה היא נושא מרכזי או רעיון עיקרי, למשל כבוד, אהבה, בדידות.</w:t>
+            </w:r>
+          </w:p>
+        </w:tc>
+        <w:tc>
+          <w:tcPr>
+            <w:tcW w:type="dxa" w:w="4365"/>
+          </w:tcPr>
+          <w:p>
+            <w:pPr>
+              <w:bidi/>
+              <w:spacing w:after="40" w:before="40" w:line="276" w:lineRule="auto"/>
+              <w:jc w:val="right"/>
+            </w:pPr>
+            <w:r/>
+            <w:r>
+              <w:rPr>
+                <w:rFonts w:ascii="David" w:hAnsi="David" w:cs="David"/>
+                <w:b w:val="0"/>
+                <w:sz w:val="21"/>
+                <w:szCs w:val="21"/>
+                <w:rtl w:val="1"/>
+              </w:rPr>
+              <w:t>בדידות (אין למי, חוזר כארבע פעמים, וגם יושבת בפינה עם הקפה, לבד באולם מלא); פער פנטזיה ומציאות (דמיינתי משהו אחר, הדמיון והמציאות זה שני דברים); כמיהה להכרה (לא שאל מה שלומי); עייפות (מגיעה הביתה ריקה, עייפה עד העצמות); משמעות (כרים קורא מילה שלמה); תכתיבים מגדריים (מה שמתאים לבת, מתי הבייבי, תהיי קשוחה).</w:t>
+            </w:r>
+          </w:p>
+        </w:tc>
+      </w:tr>
+      <w:tr>
+        <w:tc>
+          <w:tcPr>
+            <w:tcW w:type="dxa" w:w="2097"/>
+          </w:tcPr>
+          <w:p>
+            <w:pPr>
+              <w:bidi/>
+              <w:spacing w:after="40" w:before="40" w:line="276" w:lineRule="auto"/>
+              <w:jc w:val="right"/>
+            </w:pPr>
+            <w:r/>
+            <w:r>
+              <w:rPr>
+                <w:rFonts w:ascii="David" w:hAnsi="David" w:cs="David"/>
+                <w:b/>
+                <w:bCs/>
+                <w:sz w:val="21"/>
+                <w:szCs w:val="21"/>
+                <w:rtl w:val="1"/>
+              </w:rPr>
+              <w:t>9. האם מה שלמדתי בראיון סותר או מחזק את מה שידעתי ולמדתי קודם? פרטו.</w:t>
+            </w:r>
+          </w:p>
+        </w:tc>
+        <w:tc>
+          <w:tcPr>
+            <w:tcW w:type="dxa" w:w="2608"/>
+          </w:tcPr>
+          <w:p>
+            <w:pPr>
+              <w:bidi/>
+              <w:spacing w:after="40" w:before="40" w:line="276" w:lineRule="auto"/>
+              <w:jc w:val="right"/>
+            </w:pPr>
+            <w:r/>
+            <w:r>
+              <w:rPr>
+                <w:rFonts w:ascii="David" w:hAnsi="David" w:cs="David"/>
+                <w:b w:val="0"/>
+                <w:sz w:val="21"/>
+                <w:szCs w:val="21"/>
+                <w:rtl w:val="1"/>
+              </w:rPr>
+              <w:t>לכל ראיון אקדמי אנו מגיעים עם מטען של ידע תיאורטי מוקדם. ייתכן שבראיון נגלה דברים שמחזקים את התיאוריה, וייתכן שנגלה דברים הפוכים לה.</w:t>
+            </w:r>
+          </w:p>
+        </w:tc>
+        <w:tc>
+          <w:tcPr>
+            <w:tcW w:type="dxa" w:w="4365"/>
+          </w:tcPr>
+          <w:p>
+            <w:pPr>
+              <w:bidi/>
+              <w:spacing w:after="40" w:before="40" w:line="276" w:lineRule="auto"/>
+              <w:jc w:val="right"/>
+            </w:pPr>
+            <w:r/>
+            <w:r>
+              <w:rPr>
+                <w:rFonts w:ascii="David" w:hAnsi="David" w:cs="David"/>
+                <w:b w:val="0"/>
+                <w:sz w:val="21"/>
+                <w:szCs w:val="21"/>
+                <w:rtl w:val="1"/>
+              </w:rPr>
+              <w:t>חיזק את מה שלמדתי על שחיקת מורים מתחילים ועל חשיבות הליווי (Ingersoll &amp; Strong, 2011) ועל מצוקות החינוך הערבי, והתכתב עם קול האכפתיות של גיליגן, שרים מדברת על עצמה דרך הקשר לאחרים. אך ערער את ההנחה שמי שסובלת כל כך רוצה בעיקר לעזוב: אצל רים סבל ורצון להישאר חיים יחד.</w:t>
+            </w:r>
+          </w:p>
+        </w:tc>
+      </w:tr>
+      <w:tr>
+        <w:tc>
+          <w:tcPr>
+            <w:tcW w:type="dxa" w:w="2097"/>
+          </w:tcPr>
+          <w:p>
+            <w:pPr>
+              <w:bidi/>
+              <w:spacing w:after="40" w:before="40" w:line="276" w:lineRule="auto"/>
+              <w:jc w:val="right"/>
+            </w:pPr>
+            <w:r/>
+            <w:r>
+              <w:rPr>
+                <w:rFonts w:ascii="David" w:hAnsi="David" w:cs="David"/>
+                <w:b/>
+                <w:bCs/>
+                <w:sz w:val="21"/>
+                <w:szCs w:val="21"/>
+                <w:rtl w:val="1"/>
+              </w:rPr>
+              <w:t>10. ההאזנה העשירית: מה למדתי על שאלת המחקר בעקבות הניתוח? מהי התובנה המרכזית על המרואיינת ביחס לשאלת המחקר?</w:t>
+            </w:r>
+          </w:p>
+        </w:tc>
+        <w:tc>
+          <w:tcPr>
+            <w:tcW w:type="dxa" w:w="2608"/>
+          </w:tcPr>
+          <w:p>
+            <w:pPr>
+              <w:bidi/>
+              <w:spacing w:after="40" w:before="40" w:line="276" w:lineRule="auto"/>
+              <w:jc w:val="right"/>
+            </w:pPr>
+            <w:r/>
+            <w:r>
+              <w:rPr>
+                <w:rFonts w:ascii="David" w:hAnsi="David" w:cs="David"/>
+                <w:b w:val="0"/>
+                <w:sz w:val="21"/>
+                <w:szCs w:val="21"/>
+                <w:rtl w:val="1"/>
+              </w:rPr>
+              <w:t>בשדה אנו לומדים דברים רבים מעבר לשאלת המחקר. בעקבותיהם ייתכן שנשנה את שאלת המחקר, שנשאיר רק חלק ממנה, או שנישאר איתה.</w:t>
+            </w:r>
+          </w:p>
+        </w:tc>
+        <w:tc>
+          <w:tcPr>
+            <w:tcW w:type="dxa" w:w="4365"/>
+          </w:tcPr>
+          <w:p>
+            <w:pPr>
+              <w:bidi/>
+              <w:spacing w:after="40" w:before="40" w:line="276" w:lineRule="auto"/>
+              <w:jc w:val="right"/>
+            </w:pPr>
+            <w:r/>
+            <w:r>
+              <w:rPr>
+                <w:rFonts w:ascii="David" w:hAnsi="David" w:cs="David"/>
+                <w:b w:val="0"/>
+                <w:sz w:val="21"/>
+                <w:szCs w:val="21"/>
+                <w:rtl w:val="1"/>
+              </w:rPr>
+              <w:t>שאלת המחקר, חוויית מורות מתחילות במגזר הערבי בשנה הראשונה, לא השתנתה אלא התחדדה. התובנה: השנה של רים היא בדידות עמוקה בתוך מקום מלא אנשים. הפער בין הפנטזיה למציאות הוא בעיקר פער של תמיכה. היא לא נשברה מכובד העבודה בלבד, אלא מהתחושה שהיא נושאת אותו לבד.</w:t>
+            </w:r>
+          </w:p>
+        </w:tc>
+      </w:tr>
+      <w:tr>
+        <w:tc>
+          <w:tcPr>
+            <w:tcW w:type="dxa" w:w="2097"/>
+          </w:tcPr>
+          <w:p>
+            <w:pPr>
+              <w:bidi/>
+              <w:spacing w:after="40" w:before="40" w:line="276" w:lineRule="auto"/>
+              <w:jc w:val="right"/>
+            </w:pPr>
+            <w:r/>
+            <w:r>
+              <w:rPr>
+                <w:rFonts w:ascii="David" w:hAnsi="David" w:cs="David"/>
+                <w:b/>
+                <w:bCs/>
+                <w:sz w:val="21"/>
+                <w:szCs w:val="21"/>
+                <w:rtl w:val="1"/>
+              </w:rPr>
+              <w:t>11. מה עוד הייתי רוצה לדעת בזיקה לשאלת המחקר? מה הייתי מוסיפה ושואלת שלא שאלתי? מה הייתי שואלת אחרת?</w:t>
+            </w:r>
+          </w:p>
+        </w:tc>
+        <w:tc>
+          <w:tcPr>
+            <w:tcW w:type="dxa" w:w="2608"/>
+          </w:tcPr>
+          <w:p>
+            <w:pPr>
+              <w:bidi/>
+              <w:spacing w:after="40" w:before="40" w:line="276" w:lineRule="auto"/>
+              <w:jc w:val="right"/>
+            </w:pPr>
+            <w:r/>
+            <w:r>
+              <w:rPr>
+                <w:rFonts w:ascii="David" w:hAnsi="David" w:cs="David"/>
+                <w:b w:val="0"/>
+                <w:sz w:val="21"/>
+                <w:szCs w:val="21"/>
+                <w:rtl w:val="1"/>
+              </w:rPr>
+              <w:t>בדרך כלל מראיינים כמה אנשים. מוטב לעצור בין ראיון לראיון ולבצע ניתוח, כדי להקשיב לעצמנו ולזהות תמות שלא הובנו עד הסוף ושאלות שכדאי לשאול בפעם הבאה.</w:t>
+            </w:r>
+          </w:p>
+        </w:tc>
+        <w:tc>
+          <w:tcPr>
+            <w:tcW w:type="dxa" w:w="4365"/>
+          </w:tcPr>
+          <w:p>
+            <w:pPr>
+              <w:bidi/>
+              <w:spacing w:after="40" w:before="40" w:line="276" w:lineRule="auto"/>
+              <w:jc w:val="right"/>
+            </w:pPr>
+            <w:r/>
+            <w:r>
+              <w:rPr>
+                <w:rFonts w:ascii="David" w:hAnsi="David" w:cs="David"/>
+                <w:b w:val="0"/>
+                <w:sz w:val="21"/>
+                <w:szCs w:val="21"/>
+                <w:rtl w:val="1"/>
+              </w:rPr>
+              <w:t>הייתי שואלת יותר על החיים מחוץ לבית הספר, על סאמי ועל הערבים שלה אחרי יום כזה, כי שם כנראה חלק גדול מהסיפור. והייתי רוצה לראיין מורות מתחילות נוספות מכפרים אחרים, כדי לבדוק אם הבדידות היא של רים או של דור שלם של מורות ערביות צעירות.</w:t>
+            </w:r>
+          </w:p>
+        </w:tc>
+      </w:tr>
+    </w:tbl>
     <w:p>
       <w:pPr>
         <w:bidi/>
-        <w:spacing w:after="80" w:before="160" w:line="360" w:lineRule="auto"/>
-        <w:jc w:val="right"/>
-      </w:pPr>
-      <w:r>
-        <w:rPr>
-          <w:rFonts w:ascii="David" w:hAnsi="David" w:cs="David"/>
-          <w:b/>
-          <w:bCs/>
-          <w:color w:val="000000"/>
-          <w:sz w:val="27"/>
-          <w:szCs w:val="27"/>
-          <w:rtl w:val="1"/>
-        </w:rPr>
-        <w:t>הקריאה הראשונה: הסיפור</w:t>
-      </w:r>
-    </w:p>
-    <w:p>
-      <w:pPr>
-        <w:bidi/>
-        <w:spacing w:after="160" w:before="0" w:line="360" w:lineRule="auto"/>
+        <w:spacing w:after="80" w:before="0" w:line="360" w:lineRule="auto"/>
         <w:jc w:val="both"/>
       </w:pPr>
       <w:r>
@@ -1050,367 +1913,6 @@
           <w:szCs w:val="24"/>
           <w:rtl w:val="1"/>
         </w:rPr>
-        <w:t>רים, מורה מתחילה בת עשרים ושבע, מלמדת כיתה ג' בבית ספר יסודי בכפר בגליל. זו שנתה הראשונה המלאה. היא מספרת על הפער בין ההתלהבות שאיתה נכנסה לבין העייפות והבדידות שפגשה בשטח. זה סיפור על מישהי שרצתה מאוד, שנפלה, ושמצאה במהלך הדרך גם רגעים של משמעות שהחזיקו אותה. במרכז הסיפור עומד מתח מתמשך בין הרצון לתת לבין התחושה שאין לה על מי להישען, בתוך מערכת ובתוך חברה שמצפות ממנה להרבה ונותנות מעט.</w:t>
-      </w:r>
-    </w:p>
-    <w:p>
-      <w:pPr>
-        <w:bidi/>
-        <w:spacing w:after="80" w:before="160" w:line="360" w:lineRule="auto"/>
-        <w:jc w:val="right"/>
-      </w:pPr>
-      <w:r>
-        <w:rPr>
-          <w:rFonts w:ascii="David" w:hAnsi="David" w:cs="David"/>
-          <w:b/>
-          <w:bCs/>
-          <w:color w:val="000000"/>
-          <w:sz w:val="27"/>
-          <w:szCs w:val="27"/>
-          <w:rtl w:val="1"/>
-        </w:rPr>
-        <w:t>המיקום התרבותי של המרואיינת</w:t>
-      </w:r>
-    </w:p>
-    <w:p>
-      <w:pPr>
-        <w:bidi/>
-        <w:spacing w:after="160" w:before="0" w:line="360" w:lineRule="auto"/>
-        <w:jc w:val="both"/>
-      </w:pPr>
-      <w:r>
-        <w:rPr>
-          <w:rFonts w:ascii="David" w:hAnsi="David" w:cs="David"/>
-          <w:b w:val="0"/>
-          <w:sz w:val="24"/>
-          <w:szCs w:val="24"/>
-          <w:rtl w:val="1"/>
-        </w:rPr>
-        <w:t>רים ממקמת את עצמה בתוך החברה הערבית בכפר בגליל, ובתוך מערכת החינוך הערבית על מצוקותיה. היא מדברת על כיתות צפופות, על מחסור במשאבים, על "הצוות הוותיק", על המנהל. היא בת של מקום שבו הוראה נתפסת גם כשליחות וגם כמקצוע ה"מתאים לבת", כזה שמאפשר להתחתן ולגדל ילדים. כשהיא אומרת "אצלנו בכפר כולם מכירים את כולם, אין לאן לברוח", היא ממקמת את עצמה גם בתוך קהילה קטנה וצפופה, שבה המורה חשופה לעיני כולם, וגם המצוקה שלה נראית לכולם. יש לזה משקל גדול בחוויה שלה.</w:t>
-      </w:r>
-    </w:p>
-    <w:p>
-      <w:pPr>
-        <w:bidi/>
-        <w:spacing w:after="80" w:before="160" w:line="360" w:lineRule="auto"/>
-        <w:jc w:val="right"/>
-      </w:pPr>
-      <w:r>
-        <w:rPr>
-          <w:rFonts w:ascii="David" w:hAnsi="David" w:cs="David"/>
-          <w:b/>
-          <w:bCs/>
-          <w:color w:val="000000"/>
-          <w:sz w:val="27"/>
-          <w:szCs w:val="27"/>
-          <w:rtl w:val="1"/>
-        </w:rPr>
-        <w:t>מערכות יחסים ורשתות חברתיות</w:t>
-      </w:r>
-    </w:p>
-    <w:p>
-      <w:pPr>
-        <w:bidi/>
-        <w:spacing w:after="160" w:before="0" w:line="360" w:lineRule="auto"/>
-        <w:jc w:val="both"/>
-      </w:pPr>
-      <w:r>
-        <w:rPr>
-          <w:rFonts w:ascii="David" w:hAnsi="David" w:cs="David"/>
-          <w:b w:val="0"/>
-          <w:sz w:val="24"/>
-          <w:szCs w:val="24"/>
-          <w:rtl w:val="1"/>
-        </w:rPr>
-        <w:t>בסיפור של רים עולות כמה מערכות יחסים. הראשונה והמרכזית היא עם התלמידים, ובתוכם בלט כרים, ילד שהיא תיארה בפירוט רב וקשרה אליו רגשות חזקים. השנייה היא עם סועאד, החונכת שלה, קשר אמביוולנטי של הערכה מצד אחד ואכזבה מצד שני. השלישית היא עם הצוות הוותיק בחדר המורים, שממנו היא חשה מרוחקת. הרביעית היא עם המנהל, דמות סמכותית וגברית שנוכחת אך לא ממש נגישה. יש גם קשר שהיא כמעט לא הזכירה, בעלה סאמי בבית, וההיעדר הזה בלט לי דווקא. שאלתי את עצמי אם החיים הזוגיים נדחקו החוצה בגלל העומס, וזה נראה לי משמעותי לא פחות מהקשרים שכן סופרו.</w:t>
-      </w:r>
-    </w:p>
-    <w:p>
-      <w:pPr>
-        <w:bidi/>
-        <w:spacing w:after="80" w:before="160" w:line="360" w:lineRule="auto"/>
-        <w:jc w:val="right"/>
-      </w:pPr>
-      <w:r>
-        <w:rPr>
-          <w:rFonts w:ascii="David" w:hAnsi="David" w:cs="David"/>
-          <w:b/>
-          <w:bCs/>
-          <w:color w:val="000000"/>
-          <w:sz w:val="27"/>
-          <w:szCs w:val="27"/>
-          <w:rtl w:val="1"/>
-        </w:rPr>
-        <w:t>הרגשות שהתעוררו בי כמראיינת</w:t>
-      </w:r>
-    </w:p>
-    <w:p>
-      <w:pPr>
-        <w:bidi/>
-        <w:spacing w:after="160" w:before="0" w:line="360" w:lineRule="auto"/>
-        <w:jc w:val="both"/>
-      </w:pPr>
-      <w:r>
-        <w:rPr>
-          <w:rFonts w:ascii="David" w:hAnsi="David" w:cs="David"/>
-          <w:b w:val="0"/>
-          <w:sz w:val="24"/>
-          <w:szCs w:val="24"/>
-          <w:rtl w:val="1"/>
-        </w:rPr>
-        <w:t>לאורך הראיון הרגשתי הזדהות חזקה, אולי חזקה מדי. כמעט בכל משפט שרים אמרה מצאתי את עצמי חושבת "זה בדיוק מה שאני מפחדת שיקרה לי". הייתי צריכה לעצור את עצמי, כי הזדהות כזאת מסוכנת, היא גורמת לך לשמוע רק את מה שמאשר את הפחדים שלך. היו גם רגעים של חוסר סבלנות קטן, כשרים אמרה שהיא "לא מתחרטת על שנייה" מיד אחרי שסיפרה על בכי בשירותים, ורציתי לומר לה שזה לא מסתדר. עצרתי, ובניתוח החזרתי לזה. חשתי כלפיה בעיקר חום וכבוד, ואולי גם קצת אשמה, כי אני יודעת שבעוד שנה אני אשב במקומה.</w:t>
-      </w:r>
-    </w:p>
-    <w:p>
-      <w:pPr>
-        <w:bidi/>
-        <w:spacing w:after="80" w:before="160" w:line="360" w:lineRule="auto"/>
-        <w:jc w:val="right"/>
-      </w:pPr>
-      <w:r>
-        <w:rPr>
-          <w:rFonts w:ascii="David" w:hAnsi="David" w:cs="David"/>
-          <w:b/>
-          <w:bCs/>
-          <w:color w:val="000000"/>
-          <w:sz w:val="27"/>
-          <w:szCs w:val="27"/>
-          <w:rtl w:val="1"/>
-        </w:rPr>
-        <w:t>השפה והמטאפורות</w:t>
-      </w:r>
-    </w:p>
-    <w:p>
-      <w:pPr>
-        <w:bidi/>
-        <w:spacing w:after="160" w:before="0" w:line="360" w:lineRule="auto"/>
-        <w:jc w:val="both"/>
-      </w:pPr>
-      <w:r>
-        <w:rPr>
-          <w:rFonts w:ascii="David" w:hAnsi="David" w:cs="David"/>
-          <w:b w:val="0"/>
-          <w:sz w:val="24"/>
-          <w:szCs w:val="24"/>
-          <w:rtl w:val="1"/>
-        </w:rPr>
-        <w:t>השפה של רים מלאה במטאפורות של מים וטביעה. "זרקו אותי למים ומי שלא יודע לשחות, טובע", היא אמרה, ובהמשך "יש ימים שאני פשוט מרגישה שאני טובעת". במקום אחר תיארה את הכיתה בשפה של קרב: "כל בוקר זה עוד מערכה, ואת לא יודעת אם ניצחת עד שהם יוצאים". לצד אלה חזרה גם מטאפורה חמה, "הכיתה הפכה להיות הבית השני שלי". דווקא הפער בין השפה של הטביעה והקרב לבין השפה של הבית מספר הרבה על מורכבות החוויה. שני ביטויים חזרו אצלה שוב ושוב, "אין למי" מצד אחד, אין למי לפנות, אין למי לספר, ומצד שני "אלחמדוללה", שאותו אמרה גם ברגעים הקשים, כמעט כמו נשימה שמחזיקה אותה.</w:t>
-      </w:r>
-    </w:p>
-    <w:p>
-      <w:pPr>
-        <w:bidi/>
-        <w:spacing w:after="80" w:before="160" w:line="360" w:lineRule="auto"/>
-        <w:jc w:val="right"/>
-      </w:pPr>
-      <w:r>
-        <w:rPr>
-          <w:rFonts w:ascii="David" w:hAnsi="David" w:cs="David"/>
-          <w:b/>
-          <w:bCs/>
-          <w:color w:val="000000"/>
-          <w:sz w:val="27"/>
-          <w:szCs w:val="27"/>
-          <w:rtl w:val="1"/>
-        </w:rPr>
-        <w:t>סתירות ואמביוולנטיות</w:t>
-      </w:r>
-    </w:p>
-    <w:p>
-      <w:pPr>
-        <w:bidi/>
-        <w:spacing w:after="160" w:before="0" w:line="360" w:lineRule="auto"/>
-        <w:jc w:val="both"/>
-      </w:pPr>
-      <w:r>
-        <w:rPr>
-          <w:rFonts w:ascii="David" w:hAnsi="David" w:cs="David"/>
-          <w:b w:val="0"/>
-          <w:sz w:val="24"/>
-          <w:szCs w:val="24"/>
-          <w:rtl w:val="1"/>
-        </w:rPr>
-        <w:t>הראיון מלא בסתירות, ואני בחרתי לא ליישר אותן. רים אמרה "אני לא מתחרטת על שנייה" ומעט אחר כך סיפרה על בוקר שבו ישבה בשירותים ובכתה ולא רצתה לצאת. היא אמרה "אני מרגישה שאני שייכת" ובאותה נשימה "אני זרה שם, הוותיקות מסתכלות עליי כאילו אני בת קטנה". על החונכת אמרה "היא מדהימה, למדתי ממנה הכול", ומיד "אבל כשבאמת הייתי צריכה אותה, היא לא הייתה". הסתירות האלה הן לא בלבול. הן שני סיפורים שנשמעים בו זמנית, בסטריאו, כפי שגיליגן מתארת. רים גם אוהבת את המקום הזה וגם רוצה לברוח ממנו, ושתי האמיתות חיות בה יחד.</w:t>
-      </w:r>
-    </w:p>
-    <w:p>
-      <w:pPr>
-        <w:bidi/>
-        <w:spacing w:after="80" w:before="160" w:line="360" w:lineRule="auto"/>
-        <w:jc w:val="right"/>
-      </w:pPr>
-      <w:r>
-        <w:rPr>
-          <w:rFonts w:ascii="David" w:hAnsi="David" w:cs="David"/>
-          <w:b/>
-          <w:bCs/>
-          <w:color w:val="000000"/>
-          <w:sz w:val="27"/>
-          <w:szCs w:val="27"/>
-          <w:rtl w:val="1"/>
-        </w:rPr>
-        <w:t>מחאה כנגד מוסכמות חברתיות</w:t>
-      </w:r>
-    </w:p>
-    <w:p>
-      <w:pPr>
-        <w:bidi/>
-        <w:spacing w:after="160" w:before="0" w:line="360" w:lineRule="auto"/>
-        <w:jc w:val="both"/>
-      </w:pPr>
-      <w:r>
-        <w:rPr>
-          <w:rFonts w:ascii="David" w:hAnsi="David" w:cs="David"/>
-          <w:b w:val="0"/>
-          <w:sz w:val="24"/>
-          <w:szCs w:val="24"/>
-          <w:rtl w:val="1"/>
-        </w:rPr>
-        <w:t>נקודות המחאה עלו בשני מקומות. הראשון הוא סביב התכתיב של "המורה שלא מראה חולשה". סועאד אמרה לרים בתחילת השנה "אסור שהם יראו אותך נשברת, את חייבת להיות קשוחה", ורים החליטה בשלב מסוים לא לקבל את זה. "אני בכיתי פעם מול הילדים", היא אמרה, "וזה היה הרגע הכי טוב שלי איתם, הם ראו שאני בן אדם". המקום השני, ועמוק לא פחות, הוא מחאה כנגד ההנחה שהיא בחרה בהוראה כי זה "מה שמתאים לבת". רים התעקשה שזאת לא ברירת מחדל בשבילה אלא שליחות אמיתית, ובזה היא מתנגדת לתכתיב שמכתיב לאישה ערבייה צעירה איזה מקצוע "מותר" לה לרצות. יש כאן התנגדות מודעת, והיא משלמת עליה מחיר של ביקורת, גם מהצוות וגם מהמשפחה.</w:t>
-      </w:r>
-    </w:p>
-    <w:p>
-      <w:pPr>
-        <w:bidi/>
-        <w:spacing w:after="80" w:before="160" w:line="360" w:lineRule="auto"/>
-        <w:jc w:val="right"/>
-      </w:pPr>
-      <w:r>
-        <w:rPr>
-          <w:rFonts w:ascii="David" w:hAnsi="David" w:cs="David"/>
-          <w:b/>
-          <w:bCs/>
-          <w:color w:val="000000"/>
-          <w:sz w:val="27"/>
-          <w:szCs w:val="27"/>
-          <w:rtl w:val="1"/>
-        </w:rPr>
-        <w:t>תמות חוזרות</w:t>
-      </w:r>
-    </w:p>
-    <w:p>
-      <w:pPr>
-        <w:bidi/>
-        <w:spacing w:after="160" w:before="0" w:line="360" w:lineRule="auto"/>
-        <w:jc w:val="both"/>
-      </w:pPr>
-      <w:r>
-        <w:rPr>
-          <w:rFonts w:ascii="David" w:hAnsi="David" w:cs="David"/>
-          <w:b w:val="0"/>
-          <w:sz w:val="24"/>
-          <w:szCs w:val="24"/>
-          <w:rtl w:val="1"/>
-        </w:rPr>
-        <w:t>זיהיתי בטקסט כמה תמות שחוזרות שוב ושוב, וסימנתי לעצמי בטקסט את המופעים של כל אחת. הבולטת היא הבדידות. הביטוי "אין למי" חוזר לפחות ארבע פעמים לאורך הראיון, וגם "אני יושבת בפינה עם הקפה שלי וזהו" ו"לגמרי לבד בתוך אולם מלא אנשים" שייכים לה. תמה שנייה היא הפער בין הפנטזיה למציאות, שמופיעה כבר בהתחלה, "דמיינתי משהו אחר לגמרי", ומגיעה לשיא ב"הדמיון והמציאות זה שני דברים". תמה שלישית היא הכמיהה להכרה, הרצון שמישהו יראה כמה קשה היא עובדת, שבולט כשהיא מספרת על המנהל ש"לא שאל מה שלומי". תמה רביעית היא העייפות והשחיקה הגופנית ממש, "אני מגיעה הביתה ריקה", "עייפה עד העצמות". תמה חמישית היא המשמעות, אותם רגעים עם התלמידים שבגללם היא נשארת, ובראשם הסצנה שבה כרים קורא מילה שלמה. ותמה שישית, התכתיבים החברתיים והמגדריים בחברה הערבית, סביב "מורה טובה" וסביב "בת טובה", שחוזרים ב"מה שמתאים לבת", ב"מתי הבייבי" וב"תהיי קשוחה".</w:t>
-      </w:r>
-    </w:p>
-    <w:p>
-      <w:pPr>
-        <w:bidi/>
-        <w:spacing w:after="80" w:before="160" w:line="360" w:lineRule="auto"/>
-        <w:jc w:val="right"/>
-      </w:pPr>
-      <w:r>
-        <w:rPr>
-          <w:rFonts w:ascii="David" w:hAnsi="David" w:cs="David"/>
-          <w:b/>
-          <w:bCs/>
-          <w:color w:val="000000"/>
-          <w:sz w:val="27"/>
-          <w:szCs w:val="27"/>
-          <w:rtl w:val="1"/>
-        </w:rPr>
-        <w:t>מול הידע הקודם</w:t>
-      </w:r>
-    </w:p>
-    <w:p>
-      <w:pPr>
-        <w:bidi/>
-        <w:spacing w:after="160" w:before="0" w:line="360" w:lineRule="auto"/>
-        <w:jc w:val="both"/>
-      </w:pPr>
-      <w:r>
-        <w:rPr>
-          <w:rFonts w:ascii="David" w:hAnsi="David" w:cs="David"/>
-          <w:b w:val="0"/>
-          <w:sz w:val="24"/>
-          <w:szCs w:val="24"/>
-          <w:rtl w:val="1"/>
-        </w:rPr>
-        <w:t>מה ששמעתי חיזק חלק ממה שידעתי מראש וגם ערער חלק. הוא חיזק את מה שלמדתי על שחיקה של מורים מתחילים ועל החשיבות של ליווי אמיתי בשנים הראשונות, שהמחקר מראה שהוא מה שמבדיל בין מורה שנשארת למורה שעוזבת (Ingersoll &amp; Strong, 2011), ועל הקשיים המיוחדים של מערכת החינוך הערבית, המשאבים החסרים והכיתות הצפופות. הוא גם התכתב עם מה שגיליגן קוראת לו הקול של האכפתיות, אותה נטייה של רים לדבר על עצמה דרך הקשר שלה לאחרים ולא דרך הישגים. אבל הוא גם ערער הנחה שלי. באתי עם ההנחה שמורה מתחילה שסובלת כל כך רוצה בעיקר לעזוב, ורים לימדה אותי שאפשר לסבול ולרצות להישאר בו זמנית, ושהמשמעות והכאב לא סותרים אלא חיים יחד. וגם ההנחה שלי שהיא נדחפה להוראה בגלל החברה התבררה כשטחית, כי רים דווקא בחרה בזה מתוך רצון עמוק, וזה לא הסתדר עם התמונה הפשטנית שהבאתי איתי.</w:t>
-      </w:r>
-    </w:p>
-    <w:p>
-      <w:pPr>
-        <w:bidi/>
-        <w:spacing w:after="80" w:before="160" w:line="360" w:lineRule="auto"/>
-        <w:jc w:val="right"/>
-      </w:pPr>
-      <w:r>
-        <w:rPr>
-          <w:rFonts w:ascii="David" w:hAnsi="David" w:cs="David"/>
-          <w:b/>
-          <w:bCs/>
-          <w:color w:val="000000"/>
-          <w:sz w:val="27"/>
-          <w:szCs w:val="27"/>
-          <w:rtl w:val="1"/>
-        </w:rPr>
-        <w:t>התובנה המרכזית ביחס לשאלת המחקר</w:t>
-      </w:r>
-    </w:p>
-    <w:p>
-      <w:pPr>
-        <w:bidi/>
-        <w:spacing w:after="160" w:before="0" w:line="360" w:lineRule="auto"/>
-        <w:jc w:val="both"/>
-      </w:pPr>
-      <w:r>
-        <w:rPr>
-          <w:rFonts w:ascii="David" w:hAnsi="David" w:cs="David"/>
-          <w:b w:val="0"/>
-          <w:sz w:val="24"/>
-          <w:szCs w:val="24"/>
-          <w:rtl w:val="1"/>
-        </w:rPr>
-        <w:t>שאלת המחקר שלי הייתה מהי חווייתן של מורות מתחילות במגזר הערבי בשנתן הראשונה. ניתוח הראיון לא שינה אותה, אלא חידד אותה. התובנה המרכזית שלי היא שהשנה הראשונה של רים היא חוויה של בדידות עמוקה בתוך מקום מלא אנשים. היא מוקפת בשלושים וחמישה תלמידים, בצוות שלם, בחונכת ובמנהל, בכפר שכולם בו מכירים אותה, ובכל זאת מרגישה שאין לה על מי להישען. הפער בין הפנטזיה למציאות הוא לא רק פער של עומס עבודה או של משאבים, הוא פער של תמיכה. רים לא נשברה מכובד העבודה בלבד, אלא מהתחושה שהיא נושאת אותו לבד, מול מערכת שחסרה לה ומול חברה שמצפה ממנה להיות חזקה בשקט.</w:t>
-      </w:r>
-    </w:p>
-    <w:p>
-      <w:pPr>
-        <w:bidi/>
-        <w:spacing w:after="80" w:before="160" w:line="360" w:lineRule="auto"/>
-        <w:jc w:val="right"/>
-      </w:pPr>
-      <w:r>
-        <w:rPr>
-          <w:rFonts w:ascii="David" w:hAnsi="David" w:cs="David"/>
-          <w:b/>
-          <w:bCs/>
-          <w:color w:val="000000"/>
-          <w:sz w:val="27"/>
-          <w:szCs w:val="27"/>
-          <w:rtl w:val="1"/>
-        </w:rPr>
-        <w:t>מה עוד הייתי רוצה לדעת</w:t>
-      </w:r>
-    </w:p>
-    <w:p>
-      <w:pPr>
-        <w:bidi/>
-        <w:spacing w:after="160" w:before="0" w:line="360" w:lineRule="auto"/>
-        <w:jc w:val="both"/>
-      </w:pPr>
-      <w:r>
-        <w:rPr>
-          <w:rFonts w:ascii="David" w:hAnsi="David" w:cs="David"/>
-          <w:b w:val="0"/>
-          <w:sz w:val="24"/>
-          <w:szCs w:val="24"/>
-          <w:rtl w:val="1"/>
-        </w:rPr>
-        <w:t>אילו יכולתי לחזור, הייתי שואלת יותר על החיים של רים מחוץ לבית הספר. כמעט לא נגעתי בבעל, במשפחה, במה שקורה לה בערב אחרי יום כזה, ואני חושבת שדווקא שם מסתתר חלק גדול מהסיפור. הייתי גם רוצה לראיין מורות מתחילות נוספות מכפרים אחרים, כדי לבדוק אם הבדידות הזאת היא של רים או של דור שלם של מורות ערביות צעירות.</w:t>
       </w:r>
     </w:p>
     <w:p>

</xml_diff>

<commit_message>
Remove unrequested bibliography; expand personal reflection
The lecturer guidelines do not ask for a references list, so remove it
along with the now-orphaned in-text citations. Expand section 6 (personal
reflection) with three more paragraphs: the sleepless night after the
interview, the researcher/human boundary when the interviewee cried, and
what the researcher takes forward.

Co-Authored-By: Claude Opus 4.8 <noreply@anthropic.com>
Claude-Session: https://claude.ai/code/session_01RbgP5xo8dmoCfJMjFozdfN
</commit_message>
<xml_diff>
--- a/עבודה מסכמת - מחקר מתקדם בחינוך - גראם.docx
+++ b/עבודה מסכמת - מחקר מתקדם בחינוך - גראם.docx
@@ -301,23 +301,6 @@
           <w:szCs w:val="25"/>
           <w:rtl w:val="1"/>
         </w:rPr>
-        <w:t>רשימת מקורות</w:t>
-      </w:r>
-    </w:p>
-    <w:p>
-      <w:pPr>
-        <w:bidi/>
-        <w:spacing w:after="120" w:before="0" w:line="360" w:lineRule="auto"/>
-        <w:jc w:val="right"/>
-      </w:pPr>
-      <w:r>
-        <w:rPr>
-          <w:rFonts w:ascii="David" w:hAnsi="David" w:cs="David"/>
-          <w:b w:val="0"/>
-          <w:sz w:val="25"/>
-          <w:szCs w:val="25"/>
-          <w:rtl w:val="1"/>
-        </w:rPr>
         <w:t>נספח: תמליל הראיון המלא</w:t>
       </w:r>
     </w:p>
@@ -1014,7 +997,7 @@
           <w:szCs w:val="24"/>
           <w:rtl w:val="1"/>
         </w:rPr>
-        <w:t>ניתחתי את הראיון על פי מדריך ההקשבה של קרול גיליגן, כפי שלמדנו ביחידות שבע ושמונה ובמצגת של השיעור השלישי, שלב אחר שלב. המדריך הזה, שגיליגן ועמיתיה פיתחו כשיטת ניתוח יחסית וממוקדת קול (Gilligan, 1982; Gilligan et al., 2003), מבקש להקשיב לכמה קולות בו זמנית ולא ליישר את הסיפור לכדי נרטיב אחד חלק. ניסיתי לשמור על העיקרון הזה לכל אורך הדרך.</w:t>
+        <w:t>ניתחתי את הראיון על פי מדריך ההקשבה של קרול גיליגן, כפי שלמדנו ביחידות שבע ושמונה ובמצגת של השיעור השלישי, שלב אחר שלב. המדריך הזה, שגיליגן ועמיתיה פיתחו כשיטת ניתוח יחסית וממוקדת קול, מבקש להקשיב לכמה קולות בו זמנית ולא ליישר את הסיפור לכדי נרטיב אחד חלק. ניסיתי לשמור על העיקרון הזה לכל אורך הדרך.</w:t>
       </w:r>
     </w:p>
     <w:tbl>
@@ -1749,7 +1732,7 @@
                 <w:szCs w:val="21"/>
                 <w:rtl w:val="1"/>
               </w:rPr>
-              <w:t>חיזק את מה שלמדתי על שחיקת מורים מתחילים ועל חשיבות הליווי (Ingersoll &amp; Strong, 2011) ועל מצוקות החינוך הערבי, והתכתב עם קול האכפתיות של גיליגן, שרים מדברת על עצמה דרך הקשר לאחרים. אך ערער את ההנחה שמי שסובלת כל כך רוצה בעיקר לעזוב: אצל רים סבל ורצון להישאר חיים יחד.</w:t>
+              <w:t>חיזק את מה שלמדתי על שחיקת מורים מתחילים ועל חשיבות הליווי בשנים הראשונות ועל מצוקות החינוך הערבי, והתכתב עם קול האכפתיות של גיליגן, שרים מדברת על עצמה דרך הקשר לאחרים. אך ערער את ההנחה שמי שסובלת כל כך רוצה בעיקר לעזוב: אצל רים סבל ורצון להישאר חיים יחד.</w:t>
             </w:r>
           </w:p>
         </w:tc>
@@ -2103,6 +2086,23 @@
           <w:szCs w:val="24"/>
           <w:rtl w:val="1"/>
         </w:rPr>
+        <w:t>בלילה אחרי הראיון לא הצלחתי להירדם. חזרתי שוב ושוב למשפט של רים, "אין למי". חשבתי על עצמי בעוד שנה, לבד באיזה חדר מורים, ותפסתי את עצמי חושבת אולי אני בכלל לא רוצה את זה. ואז נזכרתי בפנים שלה כשסיפרה על כרים שקורא מילה שלמה, איך היא נדלקה, וזה בלבל אותי עוד יותר. יצאתי מהראיון עם פחות ביטחון לגבי העתיד שלי, לא יותר. לא בטוח שזה מה שחיפשתי, אבל זה מה שקרה.</w:t>
+      </w:r>
+    </w:p>
+    <w:p>
+      <w:pPr>
+        <w:bidi/>
+        <w:spacing w:after="160" w:before="0" w:line="360" w:lineRule="auto"/>
+        <w:jc w:val="both"/>
+      </w:pPr>
+      <w:r>
+        <w:rPr>
+          <w:rFonts w:ascii="David" w:hAnsi="David" w:cs="David"/>
+          <w:b w:val="0"/>
+          <w:sz w:val="24"/>
+          <w:szCs w:val="24"/>
+          <w:rtl w:val="1"/>
+        </w:rPr>
         <w:t>ומשהו על הזהות שלי. נכנסתי בטוחה שאני ורים "מאותו מקום", שתינו ערביות, שתינו מהכפר, ולכן אני אבין אותה מיד. ובאמצע הבנתי שזאת בדיוק ההנחה שהזהירו אותנו מפניה בשיעור הראשון, ההנחה שאני מבינה תרבות של אחר רק כי היא קרובה אליי. רים היא לא אני. היא נשואה, היא כבר בפנים, היא מכפר אחר עם דינמיקה אחרת. הייתי צריכה להזכיר לעצמי שוב ושוב להקשיב לה, לא לסיפור שכבר היה לי בראש עליה.</w:t>
       </w:r>
     </w:p>
@@ -2137,41 +2137,13 @@
           <w:szCs w:val="24"/>
           <w:rtl w:val="1"/>
         </w:rPr>
-        <w:t>לגבי הנושא עצמו, אני יוצאת פחות בטוחה בהנחות שהבאתי. באתי עם סיפור מוכן בראש, על מערכת שזורקת מורות למים ועל חברה שמכתיבה להן את הדרך, ורים סיבכה לי אותו. היא באמת סובלת, וגם באמת אוהבת. היא כועסת על המערכת, וגם מרגישה שם בבית. אני לא יכולה יותר לספר את הסיפור הפשוט שרציתי לספר, וזה טוב. אני חושבת שנכנסתי לזה כדי לאשר משהו שכבר ידעתי, ויצאתי עם יותר שאלות מתשובות. אולי זה בדיוק העניין.</w:t>
+        <w:t>היה עוד משהו שהעסיק אותי, הגבול ביני לבין רים. הייתי אמורה להיות חוקרת, ובאמצע השיחה, כשהיא בכתה, הפסקתי להיות חוקרת ופשוט הייתי בן אדם מולה, אולי גם קצת חברה. שאלתי את עצמי אם זה פגם, שאיבדתי את המרחק. היום אני חושבת שלא. דווקא הרגע שבו ויתרתי על המרחק הוא הרגע שבו היא נפתחה הכי הרבה. אבל זה משאיר אותי עם שאלה שאין לי עליה תשובה, איפה עובר הגבול, ומה עושים כשהמרואיינת היא לא נושא מחקר אלא מישהי שכואב לה מולך.</w:t>
       </w:r>
     </w:p>
     <w:p>
       <w:pPr>
         <w:bidi/>
-      </w:pPr>
-      <w:r>
-        <w:br w:type="page"/>
-      </w:r>
-    </w:p>
-    <w:p>
-      <w:pPr>
-        <w:bidi/>
-        <w:spacing w:after="200" w:before="200" w:line="360" w:lineRule="auto"/>
-        <w:jc w:val="right"/>
-      </w:pPr>
-      <w:r>
-        <w:rPr>
-          <w:rFonts w:ascii="David" w:hAnsi="David" w:cs="David"/>
-          <w:b/>
-          <w:bCs/>
-          <w:color w:val="000000"/>
-          <w:sz w:val="34"/>
-          <w:szCs w:val="34"/>
-          <w:rtl w:val="1"/>
-        </w:rPr>
-        <w:t>רשימת מקורות</w:t>
-      </w:r>
-    </w:p>
-    <w:p>
-      <w:pPr>
-        <w:bidi/>
-        <w:spacing w:after="160" w:line="360" w:lineRule="auto"/>
-        <w:ind w:left="425" w:hanging="425"/>
+        <w:spacing w:after="160" w:before="0" w:line="360" w:lineRule="auto"/>
         <w:jc w:val="both"/>
       </w:pPr>
       <w:r>
@@ -2182,67 +2154,24 @@
           <w:szCs w:val="24"/>
           <w:rtl w:val="1"/>
         </w:rPr>
-        <w:t>מדריך ההקשבה של קרול גיליגן, מתוך חומרי הקורס "מחקר מתקדם בחינוך", יחידות שבע ושמונה ומצגות השיעורים הראשון עד השלישי.</w:t>
+        <w:t>אני לוקחת מהראיון הזה דבר קטן אחד. רים אמרה שהיא מקווה שבעוד עשר שנים היא תהיה המורה הוותיקה שרואה מורה צעירה לבד בחדר מורים והולכת לשבת לידה. אני רוצה להיות ככה, אבל אני כבר לא רוצה לחכות עשר שנים. אם אני אכנס בשנה הבאה ואפגוש מורה כמו רים, אני מקווה שאזכור את השיחה הזאת מספיק כדי לשבת לידה. זה לא פותר כלום, אני יודעת. זה רק כיסא אחד ליד מישהי. אבל אחרי ששמעתי את רים, זה נראה לי הרבה.</w:t>
       </w:r>
     </w:p>
     <w:p>
       <w:pPr>
-        <w:spacing w:after="160" w:line="360" w:lineRule="auto"/>
-        <w:ind w:left="709" w:hanging="709"/>
-        <w:jc w:val="left"/>
+        <w:bidi/>
+        <w:spacing w:after="160" w:before="0" w:line="360" w:lineRule="auto"/>
+        <w:jc w:val="both"/>
       </w:pPr>
       <w:r>
         <w:rPr>
-          <w:rFonts w:ascii="Times New Roman" w:hAnsi="Times New Roman"/>
-          <w:color w:val="000000"/>
+          <w:rFonts w:ascii="David" w:hAnsi="David" w:cs="David"/>
+          <w:b w:val="0"/>
           <w:sz w:val="24"/>
+          <w:szCs w:val="24"/>
+          <w:rtl w:val="1"/>
         </w:rPr>
-        <w:t>Brown, L. M., &amp; Gilligan, C. (1992). Meeting at the Crossroads: Women's Psychology and Girls' Development. Cambridge, MA: Harvard University Press.</w:t>
-      </w:r>
-    </w:p>
-    <w:p>
-      <w:pPr>
-        <w:spacing w:after="160" w:line="360" w:lineRule="auto"/>
-        <w:ind w:left="709" w:hanging="709"/>
-        <w:jc w:val="left"/>
-      </w:pPr>
-      <w:r>
-        <w:rPr>
-          <w:rFonts w:ascii="Times New Roman" w:hAnsi="Times New Roman"/>
-          <w:color w:val="000000"/>
-          <w:sz w:val="24"/>
-        </w:rPr>
-        <w:t>Gilligan, C. (1982). In a Different Voice: Psychological Theory and Women's Development. Cambridge, MA: Harvard University Press.</w:t>
-      </w:r>
-    </w:p>
-    <w:p>
-      <w:pPr>
-        <w:spacing w:after="160" w:line="360" w:lineRule="auto"/>
-        <w:ind w:left="709" w:hanging="709"/>
-        <w:jc w:val="left"/>
-      </w:pPr>
-      <w:r>
-        <w:rPr>
-          <w:rFonts w:ascii="Times New Roman" w:hAnsi="Times New Roman"/>
-          <w:color w:val="000000"/>
-          <w:sz w:val="24"/>
-        </w:rPr>
-        <w:t>Gilligan, C., Spencer, R., Weinberg, M. K., &amp; Bertsch, T. (2003). On the Listening Guide: A voice-centered relational method. In P. M. Camic, J. E. Rhodes, &amp; L. Yardley (Eds.), Qualitative Research in Psychology: Expanding Perspectives in Methodology and Design (pp. 157-172). Washington, DC: American Psychological Association.</w:t>
-      </w:r>
-    </w:p>
-    <w:p>
-      <w:pPr>
-        <w:spacing w:after="160" w:line="360" w:lineRule="auto"/>
-        <w:ind w:left="709" w:hanging="709"/>
-        <w:jc w:val="left"/>
-      </w:pPr>
-      <w:r>
-        <w:rPr>
-          <w:rFonts w:ascii="Times New Roman" w:hAnsi="Times New Roman"/>
-          <w:color w:val="000000"/>
-          <w:sz w:val="24"/>
-        </w:rPr>
-        <w:t>Ingersoll, R. M., &amp; Strong, M. (2011). The impact of induction and mentoring programs for beginning teachers: A critical review of the research. Review of Educational Research, 81(2), 201-233.</w:t>
+        <w:t>לגבי הנושא עצמו, אני יוצאת פחות בטוחה בהנחות שהבאתי. באתי עם סיפור מוכן בראש, על מערכת שזורקת מורות למים ועל חברה שמכתיבה להן את הדרך, ורים סיבכה לי אותו. היא באמת סובלת, וגם באמת אוהבת. היא כועסת על המערכת, וגם מרגישה שם בבית. אני לא יכולה יותר לספר את הסיפור הפשוט שרציתי לספר, וזה טוב. אני חושבת שנכנסתי לזה כדי לאשר משהו שכבר ידעתי, ויצאתי עם יותר שאלות מתשובות. אולי זה בדיוק העניין.</w:t>
       </w:r>
     </w:p>
     <w:p>

</xml_diff>

<commit_message>
Replace manual TOC with an automatic Word TOC field
Map section titles to real Heading 1 styles and insert a TOC field
(\o "1-2" \h \z \u) that Word populates with live page numbers. Force
update-fields on open, set RTL paragraph defaults, and make heading and
hyperlink styles black so the generated table of contents renders
right-to-left and fully black.

Co-Authored-By: Claude Opus 4.8 <noreply@anthropic.com>
Claude-Session: https://claude.ai/code/session_01RbgP5xo8dmoCfJMjFozdfN
</commit_message>
<xml_diff>
--- a/עבודה מסכמת - מחקר מתקדם בחינוך - גראם.docx
+++ b/עבודה מסכמת - מחקר מתקדם בחינוך - גראם.docx
@@ -188,120 +188,58 @@
     <w:p>
       <w:pPr>
         <w:bidi/>
-        <w:spacing w:after="120" w:before="0" w:line="360" w:lineRule="auto"/>
+        <w:spacing w:line="360" w:lineRule="auto"/>
         <w:jc w:val="right"/>
       </w:pPr>
       <w:r>
         <w:rPr>
           <w:rFonts w:ascii="David" w:hAnsi="David" w:cs="David"/>
           <w:b w:val="0"/>
-          <w:sz w:val="25"/>
-          <w:szCs w:val="25"/>
+          <w:sz w:val="24"/>
+          <w:szCs w:val="24"/>
           <w:rtl w:val="1"/>
         </w:rPr>
-        <w:t>1. בחירת הנושא והמניעים האישיים</w:t>
+        <w:fldChar w:fldCharType="begin"/>
       </w:r>
-    </w:p>
-    <w:p>
-      <w:pPr>
-        <w:bidi/>
-        <w:spacing w:after="120" w:before="0" w:line="360" w:lineRule="auto"/>
-        <w:jc w:val="right"/>
-      </w:pPr>
       <w:r>
         <w:rPr>
           <w:rFonts w:ascii="David" w:hAnsi="David" w:cs="David"/>
           <w:b w:val="0"/>
-          <w:sz w:val="25"/>
-          <w:szCs w:val="25"/>
+          <w:sz w:val="24"/>
+          <w:szCs w:val="24"/>
           <w:rtl w:val="1"/>
         </w:rPr>
-        <w:t>2. שאלות המחקר</w:t>
+        <w:instrText xml:space="preserve"> TOC \o "1-2" \h \z \u </w:instrText>
       </w:r>
-    </w:p>
-    <w:p>
-      <w:pPr>
-        <w:bidi/>
-        <w:spacing w:after="120" w:before="0" w:line="360" w:lineRule="auto"/>
-        <w:jc w:val="right"/>
-      </w:pPr>
       <w:r>
         <w:rPr>
           <w:rFonts w:ascii="David" w:hAnsi="David" w:cs="David"/>
           <w:b w:val="0"/>
-          <w:sz w:val="25"/>
-          <w:szCs w:val="25"/>
+          <w:sz w:val="24"/>
+          <w:szCs w:val="24"/>
           <w:rtl w:val="1"/>
         </w:rPr>
-        <w:t>3. תדריך הראיון</w:t>
+        <w:fldChar w:fldCharType="separate"/>
       </w:r>
-    </w:p>
-    <w:p>
-      <w:pPr>
-        <w:bidi/>
-        <w:spacing w:after="120" w:before="0" w:line="360" w:lineRule="auto"/>
-        <w:jc w:val="right"/>
-      </w:pPr>
       <w:r>
         <w:rPr>
           <w:rFonts w:ascii="David" w:hAnsi="David" w:cs="David"/>
           <w:b w:val="0"/>
-          <w:sz w:val="25"/>
-          <w:szCs w:val="25"/>
+          <w:sz w:val="22"/>
+          <w:szCs w:val="22"/>
           <w:rtl w:val="1"/>
         </w:rPr>
-        <w:t>4. ניתוח הראיון על פי מדריך ההקשבה של קרול גיליגן</w:t>
+        <w:t>לעדכון תוכן העניינים: לחצו לחיצה ימנית עליו ובחרו "עדכן שדה", או סמנו והקישו F9.</w:t>
       </w:r>
-    </w:p>
-    <w:p>
-      <w:pPr>
-        <w:bidi/>
-        <w:spacing w:after="120" w:before="0" w:line="360" w:lineRule="auto"/>
-        <w:jc w:val="right"/>
-      </w:pPr>
       <w:r>
         <w:rPr>
           <w:rFonts w:ascii="David" w:hAnsi="David" w:cs="David"/>
           <w:b w:val="0"/>
-          <w:sz w:val="25"/>
-          <w:szCs w:val="25"/>
+          <w:sz w:val="24"/>
+          <w:szCs w:val="24"/>
           <w:rtl w:val="1"/>
         </w:rPr>
-        <w:t>5. התייחסות המרואיינת לתמליל ולניתוח</w:t>
-      </w:r>
-    </w:p>
-    <w:p>
-      <w:pPr>
-        <w:bidi/>
-        <w:spacing w:after="120" w:before="0" w:line="360" w:lineRule="auto"/>
-        <w:jc w:val="right"/>
-      </w:pPr>
-      <w:r>
-        <w:rPr>
-          <w:rFonts w:ascii="David" w:hAnsi="David" w:cs="David"/>
-          <w:b w:val="0"/>
-          <w:sz w:val="25"/>
-          <w:szCs w:val="25"/>
-          <w:rtl w:val="1"/>
-        </w:rPr>
-        <w:t>6. רפלקציה אישית</w:t>
-      </w:r>
-    </w:p>
-    <w:p>
-      <w:pPr>
-        <w:bidi/>
-        <w:spacing w:after="120" w:before="0" w:line="360" w:lineRule="auto"/>
-        <w:jc w:val="right"/>
-      </w:pPr>
-      <w:r>
-        <w:rPr>
-          <w:rFonts w:ascii="David" w:hAnsi="David" w:cs="David"/>
-          <w:b w:val="0"/>
-          <w:sz w:val="25"/>
-          <w:szCs w:val="25"/>
-          <w:rtl w:val="1"/>
-        </w:rPr>
-        <w:t>נספח: תמליל הראיון המלא</w:t>
+        <w:fldChar w:fldCharType="end"/>
       </w:r>
     </w:p>
     <w:p>
@@ -314,8 +252,9 @@
     </w:p>
     <w:p>
       <w:pPr>
+        <w:pStyle w:val="Heading1"/>
         <w:bidi/>
-        <w:spacing w:after="200" w:before="200" w:line="360" w:lineRule="auto"/>
+        <w:spacing w:before="200" w:after="200" w:line="312" w:lineRule="auto"/>
         <w:jc w:val="right"/>
       </w:pPr>
       <w:r>
@@ -452,8 +391,9 @@
     </w:p>
     <w:p>
       <w:pPr>
+        <w:pStyle w:val="Heading1"/>
         <w:bidi/>
-        <w:spacing w:after="200" w:before="200" w:line="360" w:lineRule="auto"/>
+        <w:spacing w:before="200" w:after="200" w:line="312" w:lineRule="auto"/>
         <w:jc w:val="right"/>
       </w:pPr>
       <w:r>
@@ -556,8 +496,9 @@
     </w:p>
     <w:p>
       <w:pPr>
+        <w:pStyle w:val="Heading1"/>
         <w:bidi/>
-        <w:spacing w:after="200" w:before="200" w:line="360" w:lineRule="auto"/>
+        <w:spacing w:before="200" w:after="200" w:line="312" w:lineRule="auto"/>
         <w:jc w:val="right"/>
       </w:pPr>
       <w:r>
@@ -966,8 +907,9 @@
     </w:p>
     <w:p>
       <w:pPr>
+        <w:pStyle w:val="Heading1"/>
         <w:bidi/>
-        <w:spacing w:after="200" w:before="200" w:line="360" w:lineRule="auto"/>
+        <w:spacing w:before="200" w:after="200" w:line="312" w:lineRule="auto"/>
         <w:jc w:val="right"/>
       </w:pPr>
       <w:r>
@@ -1900,8 +1842,9 @@
     </w:p>
     <w:p>
       <w:pPr>
+        <w:pStyle w:val="Heading1"/>
         <w:bidi/>
-        <w:spacing w:after="200" w:before="200" w:line="360" w:lineRule="auto"/>
+        <w:spacing w:before="200" w:after="200" w:line="312" w:lineRule="auto"/>
         <w:jc w:val="right"/>
       </w:pPr>
       <w:r>
@@ -2004,8 +1947,9 @@
     </w:p>
     <w:p>
       <w:pPr>
+        <w:pStyle w:val="Heading1"/>
         <w:bidi/>
-        <w:spacing w:after="200" w:before="200" w:line="360" w:lineRule="auto"/>
+        <w:spacing w:before="200" w:after="200" w:line="312" w:lineRule="auto"/>
         <w:jc w:val="right"/>
       </w:pPr>
       <w:r>
@@ -2184,8 +2128,9 @@
     </w:p>
     <w:p>
       <w:pPr>
+        <w:pStyle w:val="Heading1"/>
         <w:bidi/>
-        <w:spacing w:after="200" w:before="200" w:line="360" w:lineRule="auto"/>
+        <w:spacing w:before="200" w:after="200" w:line="312" w:lineRule="auto"/>
         <w:jc w:val="right"/>
       </w:pPr>
       <w:r>
@@ -4007,6 +3952,7 @@
     <w:pPrDefault>
       <w:pPr>
         <w:spacing w:after="200" w:line="276" w:lineRule="auto"/>
+        <w:bidi/>
       </w:pPr>
     </w:pPrDefault>
   </w:docDefaults>
@@ -4220,7 +4166,7 @@
       <w:rFonts w:asciiTheme="majorHAnsi" w:eastAsiaTheme="majorEastAsia" w:hAnsiTheme="majorHAnsi" w:cstheme="majorBidi"/>
       <w:b/>
       <w:bCs/>
-      <w:color w:val="365F91" w:themeColor="accent1" w:themeShade="BF"/>
+      <w:color w:val="000000"/>
       <w:sz w:val="28"/>
       <w:szCs w:val="28"/>
     </w:rPr>
@@ -4244,7 +4190,7 @@
       <w:rFonts w:asciiTheme="majorHAnsi" w:eastAsiaTheme="majorEastAsia" w:hAnsiTheme="majorHAnsi" w:cstheme="majorBidi"/>
       <w:b/>
       <w:bCs/>
-      <w:color w:val="4F81BD" w:themeColor="accent1"/>
+      <w:color w:val="000000"/>
       <w:sz w:val="26"/>
       <w:szCs w:val="26"/>
     </w:rPr>
@@ -15839,6 +15785,13 @@
         <w:shd w:val="clear" w:color="auto" w:fill="FBCAA2" w:themeFill="accent6" w:themeFillTint="7F"/>
       </w:tcPr>
     </w:tblStylePr>
+  </w:style>
+  <w:style w:type="character" w:customStyle="1" w:styleId="Hyperlink">
+    <w:name w:val="Hyperlink"/>
+    <w:rPr>
+      <w:color w:val="000000"/>
+      <w:u w:val="none"/>
+    </w:rPr>
   </w:style>
 </w:styles>
 </file>

</xml_diff>

<commit_message>
Add Ono Academic College logo to cover; hide spell-check underlines
Embed the college logo centered at the top of the cover page. Disable the
red and green proofing squiggles (hideSpellingErrors, hideGrammaticalErrors)
so no colored marks appear under the Hebrew text.

Co-Authored-By: Claude Opus 4.8 <noreply@anthropic.com>
Claude-Session: https://claude.ai/code/session_01RbgP5xo8dmoCfJMjFozdfN
</commit_message>
<xml_diff>
--- a/עבודה מסכמת - מחקר מתקדם בחינוך - גראם.docx
+++ b/עבודה מסכמת - מחקר מתקדם בחינוך - גראם.docx
@@ -4,34 +4,42 @@
   <w:body>
     <w:p>
       <w:pPr>
-        <w:bidi/>
-        <w:spacing w:after="0" w:before="0" w:line="360" w:lineRule="auto"/>
-        <w:jc w:val="both"/>
+        <w:spacing w:before="120" w:after="200"/>
+        <w:jc w:val="center"/>
       </w:pPr>
       <w:r>
-        <w:rPr>
-          <w:rFonts w:ascii="David" w:hAnsi="David" w:cs="David"/>
-          <w:b w:val="0"/>
-          <w:sz w:val="24"/>
-          <w:szCs w:val="24"/>
-          <w:rtl w:val="1"/>
-        </w:rPr>
-      </w:r>
-    </w:p>
-    <w:p>
-      <w:pPr>
-        <w:bidi/>
-        <w:spacing w:after="0" w:before="0" w:line="360" w:lineRule="auto"/>
-        <w:jc w:val="both"/>
-      </w:pPr>
-      <w:r>
-        <w:rPr>
-          <w:rFonts w:ascii="David" w:hAnsi="David" w:cs="David"/>
-          <w:b w:val="0"/>
-          <w:sz w:val="24"/>
-          <w:szCs w:val="24"/>
-          <w:rtl w:val="1"/>
-        </w:rPr>
+        <w:drawing>
+          <wp:inline xmlns:a="http://schemas.openxmlformats.org/drawingml/2006/main" xmlns:pic="http://schemas.openxmlformats.org/drawingml/2006/picture">
+            <wp:extent cx="1655999" cy="1655999"/>
+            <wp:docPr id="1" name="Picture 1"/>
+            <wp:cNvGraphicFramePr>
+              <a:graphicFrameLocks noChangeAspect="1"/>
+            </wp:cNvGraphicFramePr>
+            <a:graphic>
+              <a:graphicData uri="http://schemas.openxmlformats.org/drawingml/2006/picture">
+                <pic:pic>
+                  <pic:nvPicPr>
+                    <pic:cNvPr id="0" name="logo_ono.jpeg"/>
+                    <pic:cNvPicPr/>
+                  </pic:nvPicPr>
+                  <pic:blipFill>
+                    <a:blip r:embed="rId9"/>
+                    <a:stretch>
+                      <a:fillRect/>
+                    </a:stretch>
+                  </pic:blipFill>
+                  <pic:spPr>
+                    <a:xfrm>
+                      <a:off x="0" y="0"/>
+                      <a:ext cx="1655999" cy="1655999"/>
+                    </a:xfrm>
+                    <a:prstGeom prst="rect"/>
+                  </pic:spPr>
+                </pic:pic>
+              </a:graphicData>
+            </a:graphic>
+          </wp:inline>
+        </w:drawing>
       </w:r>
     </w:p>
     <w:p>
@@ -3704,7 +3712,7 @@
       </w:r>
     </w:p>
     <w:sectPr>
-      <w:footerReference w:type="default" r:id="rId9"/>
+      <w:footerReference w:type="default" r:id="rId10"/>
       <w:pgSz w:w="12240" w:h="15840"/>
       <w:pgMar w:top="1417" w:right="1417" w:bottom="1417" w:left="1417" w:header="720" w:footer="720" w:gutter="0"/>
       <w:cols w:space="720"/>

</xml_diff>